<commit_message>
Report optimized DBP delta results
</commit_message>
<xml_diff>
--- a/pfor_delta_layout_report.docx
+++ b/pfor_delta_layout_report.docx
@@ -5,7 +5,6 @@
     <w:p>
       <w:pPr>
         <w:pStyle w:val="Title"/>
-        <w:jc w:val="center"/>
       </w:pPr>
       <w:r>
         <w:t>PFOR delta payload layout: PatchedDelta or DBPDelta?</w:t>
@@ -16,44 +15,56 @@
         <w:pStyle w:val="Heading1"/>
       </w:pPr>
       <w:r>
-        <w:t>Question and result</w:t>
+        <w:t>Result</w:t>
       </w:r>
     </w:p>
     <w:p>
-      <w:pPr>
-        <w:spacing w:after="100"/>
-      </w:pPr>
       <w:r>
-        <w:t>When PFOR selects delta mode for a 1,024-value vector, should that vector store its deltas using PFOR's frame, bit width, and exceptions (</w:t>
+        <w:t>When PFOR selects delta mode for a 1,024-value vector, it can store differences with PFOR's frame, one bit width, and exceptions (</w:t>
       </w:r>
       <w:r>
         <w:rPr>
-          <w:rFonts w:ascii="Consolas" w:hAnsi="Consolas"/>
+          <w:rFonts w:ascii="Courier New" w:hAnsi="Courier New"/>
+          <w:b w:val="0"/>
+          <w:i w:val="0"/>
           <w:sz w:val="16"/>
         </w:rPr>
         <w:t>PFOR-PatchedDelta</w:t>
       </w:r>
       <w:r>
-        <w:t>), or as an independent Parquet DELTA_BINARY_PACKED stream (</w:t>
+        <w:t>), or put an independent Parquet DELTA_BINARY_PACKED stream in that vector (</w:t>
       </w:r>
       <w:r>
         <w:rPr>
-          <w:rFonts w:ascii="Consolas" w:hAnsi="Consolas"/>
+          <w:rFonts w:ascii="Courier New" w:hAnsi="Courier New"/>
+          <w:b w:val="0"/>
+          <w:i w:val="0"/>
           <w:sz w:val="16"/>
         </w:rPr>
         <w:t>PFOR-DBPDelta</w:t>
       </w:r>
       <w:r>
-        <w:t xml:space="preserve">)? The measurements favor </w:t>
+        <w:t xml:space="preserve">). PatchedDelta is smaller and remains faster to decompress, but optimizing the existing DBP decoder closes much of the decode gap: from 2.62x to </w:t>
       </w:r>
       <w:r>
         <w:rPr>
           <w:b/>
+          <w:i w:val="0"/>
         </w:rPr>
-        <w:t>PFOR-PatchedDelta</w:t>
+        <w:t>1.65x</w:t>
       </w:r>
       <w:r>
-        <w:t>: it is smaller and substantially faster to decompress in both dataset classes. DBPDelta encodes faster, but does not improve the read path or the aggregate compression ratio.</w:t>
+        <w:t xml:space="preserve"> on delta-beneficial datasets and from 2.95x to </w:t>
+      </w:r>
+      <w:r>
+        <w:rPr>
+          <w:b/>
+          <w:i w:val="0"/>
+        </w:rPr>
+        <w:t>1.61x</w:t>
+      </w:r>
+      <w:r>
+        <w:t xml:space="preserve"> on non-beneficial datasets. Thus the original gap was partly an implementation gap and partly a layout gap.</w:t>
       </w:r>
     </w:p>
     <w:p>
@@ -65,29 +76,59 @@
       </w:r>
     </w:p>
     <w:p>
-      <w:pPr>
-        <w:spacing w:after="100"/>
-      </w:pPr>
       <w:r>
-        <w:t>Both arms restart at exactly the same 1,024-value PFOR vector boundaries. DBPDelta uses the canonical DBP layout inside every vector (128-value blocks, four 32-value miniblocks for INT32; 256-value blocks and four 64-value miniblocks for INT64), including a new DBP header and first value per vector. Both include the same outer PFOR page header and four-byte vector offsets. Delta mode is forced so the PFOR planner cannot silently substitute raw PFOR. A separate forced-raw PFOR run classifies a dataset as *delta-beneficial* when PatchedDelta is smaller than raw PFOR; all others are *non-beneficial*.</w:t>
+        <w:t xml:space="preserve">Both layouts restart at the same 1,024-value PFOR vector boundaries and include the same outer page header and four-byte vector offsets. Delta mode is forced. A forced-raw PFOR run classifies a case as </w:t>
+      </w:r>
+      <w:r>
+        <w:rPr>
+          <w:b w:val="0"/>
+          <w:i/>
+        </w:rPr>
+        <w:t>delta-beneficial</w:t>
+      </w:r>
+      <w:r>
+        <w:t xml:space="preserve"> when PatchedDelta is smaller than raw PFOR. Baseline DBP is Arrow's decoder before the two optimization commits. Optimized DBP coalesces adjacent equal-width miniblocks into one unpack call (</w:t>
+      </w:r>
+      <w:r>
+        <w:rPr>
+          <w:rFonts w:ascii="Courier New" w:hAnsi="Courier New"/>
+          <w:b w:val="0"/>
+          <w:i w:val="0"/>
+          <w:sz w:val="16"/>
+        </w:rPr>
+        <w:t>c3b6f870d6</w:t>
+      </w:r>
+      <w:r>
+        <w:t>) and reconstructs deltas with a SIMD register prefix scan (</w:t>
+      </w:r>
+      <w:r>
+        <w:rPr>
+          <w:rFonts w:ascii="Courier New" w:hAnsi="Courier New"/>
+          <w:b w:val="0"/>
+          <w:i w:val="0"/>
+          <w:sz w:val="16"/>
+        </w:rPr>
+        <w:t>9dc8d52b17</w:t>
+      </w:r>
+      <w:r>
+        <w:t>). These are decode-only changes, so baseline and optimized DBP have identical bytes and encode throughput.</w:t>
       </w:r>
     </w:p>
     <w:p>
-      <w:pPr>
-        <w:spacing w:after="100"/>
-      </w:pPr>
       <w:r>
-        <w:t xml:space="preserve">The corpus has 54 generated column cases (39 INT32, 15 INT64), including ClickBench, TPC-DS, TPC-H, taxi, timestamp, counter, random-walk, sawtooth, sentinel, and bimodal shapes. Each column has 102,400 values. Results are geometric means of five repetitions from a Release build compiled with </w:t>
+        <w:t xml:space="preserve">The corpus has 54 generated cases (39 INT32, 15 INT64), including ClickBench, TPC-DS, TPC-H, taxi, timestamp, counter, random-walk, sawtooth, sentinel, and bimodal shapes; each has 102,400 values. Results are geometric means of five repetitions from a Release build compiled with </w:t>
       </w:r>
       <w:r>
         <w:rPr>
-          <w:rFonts w:ascii="Consolas" w:hAnsi="Consolas"/>
+          <w:rFonts w:ascii="Courier New" w:hAnsi="Courier New"/>
+          <w:b w:val="0"/>
+          <w:i w:val="0"/>
           <w:sz w:val="16"/>
         </w:rPr>
         <w:t>-O3 -DNDEBUG</w:t>
       </w:r>
       <w:r>
-        <w:t>. Compression ratio is uncompressed bytes divided by encoded bytes; higher is better. Throughput is uncompressed GB/s.</w:t>
+        <w:t>. Ratios are uncompressed/encoded bytes; throughput is uncompressed GB/s.</w:t>
       </w:r>
     </w:p>
     <w:p>
@@ -100,76 +141,154 @@
     </w:p>
     <w:tbl>
       <w:tblPr>
-        <w:tblStyle w:val="LightShading-Accent1"/>
+        <w:tblStyle w:val="TableGrid"/>
         <w:tblW w:type="auto" w:w="0"/>
         <w:tblLook w:firstColumn="1" w:firstRow="1" w:lastColumn="0" w:lastRow="0" w:noHBand="0" w:noVBand="1" w:val="04A0"/>
       </w:tblPr>
       <w:tblGrid>
-        <w:gridCol w:w="1728"/>
-        <w:gridCol w:w="1728"/>
-        <w:gridCol w:w="1728"/>
-        <w:gridCol w:w="1728"/>
-        <w:gridCol w:w="1728"/>
-        <w:gridCol w:w="1728"/>
+        <w:gridCol w:w="2400"/>
+        <w:gridCol w:w="2400"/>
+        <w:gridCol w:w="2400"/>
+        <w:gridCol w:w="2400"/>
+        <w:gridCol w:w="2400"/>
+        <w:gridCol w:w="2400"/>
       </w:tblGrid>
       <w:tr>
         <w:tc>
           <w:tcPr>
-            <w:tcW w:type="dxa" w:w="1728"/>
+            <w:tcW w:type="dxa" w:w="2400"/>
+            <w:shd w:fill="DBE5F1"/>
           </w:tcPr>
           <w:p>
             <w:r>
+              <w:rPr>
+                <w:rFonts w:ascii="Arial" w:hAnsi="Arial"/>
+                <w:b/>
+                <w:sz w:val="14"/>
+              </w:rPr>
+            </w:r>
+            <w:r>
+              <w:rPr>
+                <w:rFonts w:ascii="Arial" w:hAnsi="Arial"/>
+                <w:b/>
+                <w:sz w:val="14"/>
+              </w:rPr>
               <w:t>Compression</w:t>
             </w:r>
           </w:p>
         </w:tc>
         <w:tc>
           <w:tcPr>
-            <w:tcW w:type="dxa" w:w="1728"/>
+            <w:tcW w:type="dxa" w:w="2400"/>
+            <w:shd w:fill="DBE5F1"/>
           </w:tcPr>
           <w:p>
             <w:r>
+              <w:rPr>
+                <w:rFonts w:ascii="Arial" w:hAnsi="Arial"/>
+                <w:b/>
+                <w:sz w:val="14"/>
+              </w:rPr>
+            </w:r>
+            <w:r>
+              <w:rPr>
+                <w:rFonts w:ascii="Arial" w:hAnsi="Arial"/>
+                <w:b/>
+                <w:sz w:val="14"/>
+              </w:rPr>
               <w:t>Cases</w:t>
             </w:r>
           </w:p>
         </w:tc>
         <w:tc>
           <w:tcPr>
-            <w:tcW w:type="dxa" w:w="1728"/>
+            <w:tcW w:type="dxa" w:w="2400"/>
+            <w:shd w:fill="DBE5F1"/>
           </w:tcPr>
           <w:p>
             <w:r>
+              <w:rPr>
+                <w:rFonts w:ascii="Arial" w:hAnsi="Arial"/>
+                <w:b/>
+                <w:sz w:val="14"/>
+              </w:rPr>
+            </w:r>
+            <w:r>
+              <w:rPr>
+                <w:rFonts w:ascii="Arial" w:hAnsi="Arial"/>
+                <w:b/>
+                <w:sz w:val="14"/>
+              </w:rPr>
               <w:t>PatchedDelta ratio</w:t>
             </w:r>
           </w:p>
         </w:tc>
         <w:tc>
           <w:tcPr>
-            <w:tcW w:type="dxa" w:w="1728"/>
+            <w:tcW w:type="dxa" w:w="2400"/>
+            <w:shd w:fill="DBE5F1"/>
           </w:tcPr>
           <w:p>
             <w:r>
-              <w:t>DBPDelta ratio</w:t>
+              <w:rPr>
+                <w:rFonts w:ascii="Arial" w:hAnsi="Arial"/>
+                <w:b/>
+                <w:sz w:val="14"/>
+              </w:rPr>
+            </w:r>
+            <w:r>
+              <w:rPr>
+                <w:rFonts w:ascii="Arial" w:hAnsi="Arial"/>
+                <w:b/>
+                <w:sz w:val="14"/>
+              </w:rPr>
+              <w:t>Baseline DBP ratio</w:t>
             </w:r>
           </w:p>
         </w:tc>
         <w:tc>
           <w:tcPr>
-            <w:tcW w:type="dxa" w:w="1728"/>
+            <w:tcW w:type="dxa" w:w="2400"/>
+            <w:shd w:fill="DBE5F1"/>
           </w:tcPr>
           <w:p>
             <w:r>
-              <w:t>PatchedDelta size vs DBP</w:t>
+              <w:rPr>
+                <w:rFonts w:ascii="Arial" w:hAnsi="Arial"/>
+                <w:b/>
+                <w:sz w:val="14"/>
+              </w:rPr>
+            </w:r>
+            <w:r>
+              <w:rPr>
+                <w:rFonts w:ascii="Arial" w:hAnsi="Arial"/>
+                <w:b/>
+                <w:sz w:val="14"/>
+              </w:rPr>
+              <w:t>Optimized DBP ratio</w:t>
             </w:r>
           </w:p>
         </w:tc>
         <w:tc>
           <w:tcPr>
-            <w:tcW w:type="dxa" w:w="1728"/>
+            <w:tcW w:type="dxa" w:w="2400"/>
+            <w:shd w:fill="DBE5F1"/>
           </w:tcPr>
           <w:p>
             <w:r>
-              <w:t>Size wins</w:t>
+              <w:rPr>
+                <w:rFonts w:ascii="Arial" w:hAnsi="Arial"/>
+                <w:b/>
+                <w:sz w:val="14"/>
+              </w:rPr>
+            </w:r>
+            <w:r>
+              <w:rPr>
+                <w:rFonts w:ascii="Arial" w:hAnsi="Arial"/>
+                <w:b/>
+                <w:sz w:val="14"/>
+              </w:rPr>
+              <w:t>Patched size vs DBP</w:t>
             </w:r>
           </w:p>
         </w:tc>
@@ -177,76 +296,133 @@
       <w:tr>
         <w:tc>
           <w:tcPr>
-            <w:tcW w:type="dxa" w:w="1728"/>
+            <w:tcW w:type="dxa" w:w="2400"/>
           </w:tcPr>
           <w:p>
             <w:r>
+              <w:rPr>
+                <w:rFonts w:ascii="Arial" w:hAnsi="Arial"/>
+                <w:b w:val="0"/>
+                <w:sz w:val="14"/>
+              </w:rPr>
+            </w:r>
+            <w:r>
+              <w:rPr>
+                <w:rFonts w:ascii="Arial" w:hAnsi="Arial"/>
+                <w:b w:val="0"/>
+                <w:sz w:val="14"/>
+              </w:rPr>
               <w:t>INT32</w:t>
             </w:r>
           </w:p>
         </w:tc>
         <w:tc>
           <w:tcPr>
-            <w:tcW w:type="dxa" w:w="1728"/>
+            <w:tcW w:type="dxa" w:w="2400"/>
           </w:tcPr>
           <w:p>
-            <w:pPr>
-              <w:jc w:val="right"/>
-            </w:pPr>
             <w:r>
+              <w:rPr>
+                <w:rFonts w:ascii="Arial" w:hAnsi="Arial"/>
+                <w:b w:val="0"/>
+                <w:sz w:val="14"/>
+              </w:rPr>
+            </w:r>
+            <w:r>
+              <w:rPr>
+                <w:rFonts w:ascii="Arial" w:hAnsi="Arial"/>
+                <w:b w:val="0"/>
+                <w:sz w:val="14"/>
+              </w:rPr>
               <w:t>9</w:t>
             </w:r>
           </w:p>
         </w:tc>
         <w:tc>
           <w:tcPr>
-            <w:tcW w:type="dxa" w:w="1728"/>
+            <w:tcW w:type="dxa" w:w="2400"/>
           </w:tcPr>
           <w:p>
-            <w:pPr>
-              <w:jc w:val="right"/>
-            </w:pPr>
             <w:r>
+              <w:rPr>
+                <w:rFonts w:ascii="Arial" w:hAnsi="Arial"/>
+                <w:b w:val="0"/>
+                <w:sz w:val="14"/>
+              </w:rPr>
+            </w:r>
+            <w:r>
+              <w:rPr>
+                <w:rFonts w:ascii="Arial" w:hAnsi="Arial"/>
+                <w:b w:val="0"/>
+                <w:sz w:val="14"/>
+              </w:rPr>
               <w:t>8.150</w:t>
             </w:r>
           </w:p>
         </w:tc>
         <w:tc>
           <w:tcPr>
-            <w:tcW w:type="dxa" w:w="1728"/>
+            <w:tcW w:type="dxa" w:w="2400"/>
           </w:tcPr>
           <w:p>
-            <w:pPr>
-              <w:jc w:val="right"/>
-            </w:pPr>
             <w:r>
+              <w:rPr>
+                <w:rFonts w:ascii="Arial" w:hAnsi="Arial"/>
+                <w:b w:val="0"/>
+                <w:sz w:val="14"/>
+              </w:rPr>
+            </w:r>
+            <w:r>
+              <w:rPr>
+                <w:rFonts w:ascii="Arial" w:hAnsi="Arial"/>
+                <w:b w:val="0"/>
+                <w:sz w:val="14"/>
+              </w:rPr>
               <w:t>5.303</w:t>
             </w:r>
           </w:p>
         </w:tc>
         <w:tc>
           <w:tcPr>
-            <w:tcW w:type="dxa" w:w="1728"/>
+            <w:tcW w:type="dxa" w:w="2400"/>
           </w:tcPr>
           <w:p>
-            <w:pPr>
-              <w:jc w:val="right"/>
-            </w:pPr>
             <w:r>
-              <w:t>65.1%</w:t>
+              <w:rPr>
+                <w:rFonts w:ascii="Arial" w:hAnsi="Arial"/>
+                <w:b w:val="0"/>
+                <w:sz w:val="14"/>
+              </w:rPr>
+            </w:r>
+            <w:r>
+              <w:rPr>
+                <w:rFonts w:ascii="Arial" w:hAnsi="Arial"/>
+                <w:b w:val="0"/>
+                <w:sz w:val="14"/>
+              </w:rPr>
+              <w:t>5.303</w:t>
             </w:r>
           </w:p>
         </w:tc>
         <w:tc>
           <w:tcPr>
-            <w:tcW w:type="dxa" w:w="1728"/>
+            <w:tcW w:type="dxa" w:w="2400"/>
           </w:tcPr>
           <w:p>
-            <w:pPr>
-              <w:jc w:val="right"/>
-            </w:pPr>
             <w:r>
-              <w:t>8/9</w:t>
+              <w:rPr>
+                <w:rFonts w:ascii="Arial" w:hAnsi="Arial"/>
+                <w:b w:val="0"/>
+                <w:sz w:val="14"/>
+              </w:rPr>
+            </w:r>
+            <w:r>
+              <w:rPr>
+                <w:rFonts w:ascii="Arial" w:hAnsi="Arial"/>
+                <w:b w:val="0"/>
+                <w:sz w:val="14"/>
+              </w:rPr>
+              <w:t>65.1%</w:t>
             </w:r>
           </w:p>
         </w:tc>
@@ -254,76 +430,133 @@
       <w:tr>
         <w:tc>
           <w:tcPr>
-            <w:tcW w:type="dxa" w:w="1728"/>
+            <w:tcW w:type="dxa" w:w="2400"/>
           </w:tcPr>
           <w:p>
             <w:r>
+              <w:rPr>
+                <w:rFonts w:ascii="Arial" w:hAnsi="Arial"/>
+                <w:b w:val="0"/>
+                <w:sz w:val="14"/>
+              </w:rPr>
+            </w:r>
+            <w:r>
+              <w:rPr>
+                <w:rFonts w:ascii="Arial" w:hAnsi="Arial"/>
+                <w:b w:val="0"/>
+                <w:sz w:val="14"/>
+              </w:rPr>
               <w:t>INT64</w:t>
             </w:r>
           </w:p>
         </w:tc>
         <w:tc>
           <w:tcPr>
-            <w:tcW w:type="dxa" w:w="1728"/>
+            <w:tcW w:type="dxa" w:w="2400"/>
           </w:tcPr>
           <w:p>
-            <w:pPr>
-              <w:jc w:val="right"/>
-            </w:pPr>
             <w:r>
+              <w:rPr>
+                <w:rFonts w:ascii="Arial" w:hAnsi="Arial"/>
+                <w:b w:val="0"/>
+                <w:sz w:val="14"/>
+              </w:rPr>
+            </w:r>
+            <w:r>
+              <w:rPr>
+                <w:rFonts w:ascii="Arial" w:hAnsi="Arial"/>
+                <w:b w:val="0"/>
+                <w:sz w:val="14"/>
+              </w:rPr>
               <w:t>9</w:t>
             </w:r>
           </w:p>
         </w:tc>
         <w:tc>
           <w:tcPr>
-            <w:tcW w:type="dxa" w:w="1728"/>
+            <w:tcW w:type="dxa" w:w="2400"/>
           </w:tcPr>
           <w:p>
-            <w:pPr>
-              <w:jc w:val="right"/>
-            </w:pPr>
             <w:r>
+              <w:rPr>
+                <w:rFonts w:ascii="Arial" w:hAnsi="Arial"/>
+                <w:b w:val="0"/>
+                <w:sz w:val="14"/>
+              </w:rPr>
+            </w:r>
+            <w:r>
+              <w:rPr>
+                <w:rFonts w:ascii="Arial" w:hAnsi="Arial"/>
+                <w:b w:val="0"/>
+                <w:sz w:val="14"/>
+              </w:rPr>
               <w:t>12.447</w:t>
             </w:r>
           </w:p>
         </w:tc>
         <w:tc>
           <w:tcPr>
-            <w:tcW w:type="dxa" w:w="1728"/>
+            <w:tcW w:type="dxa" w:w="2400"/>
           </w:tcPr>
           <w:p>
-            <w:pPr>
-              <w:jc w:val="right"/>
-            </w:pPr>
             <w:r>
+              <w:rPr>
+                <w:rFonts w:ascii="Arial" w:hAnsi="Arial"/>
+                <w:b w:val="0"/>
+                <w:sz w:val="14"/>
+              </w:rPr>
+            </w:r>
+            <w:r>
+              <w:rPr>
+                <w:rFonts w:ascii="Arial" w:hAnsi="Arial"/>
+                <w:b w:val="0"/>
+                <w:sz w:val="14"/>
+              </w:rPr>
               <w:t>8.055</w:t>
             </w:r>
           </w:p>
         </w:tc>
         <w:tc>
           <w:tcPr>
-            <w:tcW w:type="dxa" w:w="1728"/>
+            <w:tcW w:type="dxa" w:w="2400"/>
           </w:tcPr>
           <w:p>
-            <w:pPr>
-              <w:jc w:val="right"/>
-            </w:pPr>
             <w:r>
-              <w:t>64.7%</w:t>
+              <w:rPr>
+                <w:rFonts w:ascii="Arial" w:hAnsi="Arial"/>
+                <w:b w:val="0"/>
+                <w:sz w:val="14"/>
+              </w:rPr>
+            </w:r>
+            <w:r>
+              <w:rPr>
+                <w:rFonts w:ascii="Arial" w:hAnsi="Arial"/>
+                <w:b w:val="0"/>
+                <w:sz w:val="14"/>
+              </w:rPr>
+              <w:t>8.055</w:t>
             </w:r>
           </w:p>
         </w:tc>
         <w:tc>
           <w:tcPr>
-            <w:tcW w:type="dxa" w:w="1728"/>
+            <w:tcW w:type="dxa" w:w="2400"/>
           </w:tcPr>
           <w:p>
-            <w:pPr>
-              <w:jc w:val="right"/>
-            </w:pPr>
             <w:r>
-              <w:t>6/9</w:t>
+              <w:rPr>
+                <w:rFonts w:ascii="Arial" w:hAnsi="Arial"/>
+                <w:b w:val="0"/>
+                <w:sz w:val="14"/>
+              </w:rPr>
+            </w:r>
+            <w:r>
+              <w:rPr>
+                <w:rFonts w:ascii="Arial" w:hAnsi="Arial"/>
+                <w:b w:val="0"/>
+                <w:sz w:val="14"/>
+              </w:rPr>
+              <w:t>64.7%</w:t>
             </w:r>
           </w:p>
         </w:tc>
@@ -331,150 +564,327 @@
       <w:tr>
         <w:tc>
           <w:tcPr>
-            <w:tcW w:type="dxa" w:w="1728"/>
+            <w:tcW w:type="dxa" w:w="2400"/>
           </w:tcPr>
           <w:p>
             <w:r>
+              <w:rPr>
+                <w:rFonts w:ascii="Arial" w:hAnsi="Arial"/>
+                <w:b w:val="0"/>
+                <w:sz w:val="14"/>
+              </w:rPr>
+            </w:r>
+            <w:r>
+              <w:rPr>
+                <w:rFonts w:ascii="Arial" w:hAnsi="Arial"/>
+                <w:b w:val="0"/>
+                <w:sz w:val="14"/>
+              </w:rPr>
               <w:t>Combined</w:t>
             </w:r>
           </w:p>
         </w:tc>
         <w:tc>
           <w:tcPr>
-            <w:tcW w:type="dxa" w:w="1728"/>
+            <w:tcW w:type="dxa" w:w="2400"/>
           </w:tcPr>
           <w:p>
-            <w:pPr>
-              <w:jc w:val="right"/>
-            </w:pPr>
             <w:r>
+              <w:rPr>
+                <w:rFonts w:ascii="Arial" w:hAnsi="Arial"/>
+                <w:b w:val="0"/>
+                <w:sz w:val="14"/>
+              </w:rPr>
+            </w:r>
+            <w:r>
+              <w:rPr>
+                <w:rFonts w:ascii="Arial" w:hAnsi="Arial"/>
+                <w:b w:val="0"/>
+                <w:sz w:val="14"/>
+              </w:rPr>
               <w:t>18</w:t>
             </w:r>
           </w:p>
         </w:tc>
         <w:tc>
           <w:tcPr>
-            <w:tcW w:type="dxa" w:w="1728"/>
+            <w:tcW w:type="dxa" w:w="2400"/>
           </w:tcPr>
           <w:p>
-            <w:pPr>
-              <w:jc w:val="right"/>
-            </w:pPr>
             <w:r>
+              <w:rPr>
+                <w:rFonts w:ascii="Arial" w:hAnsi="Arial"/>
+                <w:b w:val="0"/>
+                <w:sz w:val="14"/>
+              </w:rPr>
+            </w:r>
+            <w:r>
+              <w:rPr>
+                <w:rFonts w:ascii="Arial" w:hAnsi="Arial"/>
+                <w:b w:val="0"/>
+                <w:sz w:val="14"/>
+              </w:rPr>
               <w:t>10.072</w:t>
             </w:r>
           </w:p>
         </w:tc>
         <w:tc>
           <w:tcPr>
-            <w:tcW w:type="dxa" w:w="1728"/>
+            <w:tcW w:type="dxa" w:w="2400"/>
           </w:tcPr>
           <w:p>
-            <w:pPr>
-              <w:jc w:val="right"/>
-            </w:pPr>
             <w:r>
+              <w:rPr>
+                <w:rFonts w:ascii="Arial" w:hAnsi="Arial"/>
+                <w:b w:val="0"/>
+                <w:sz w:val="14"/>
+              </w:rPr>
+            </w:r>
+            <w:r>
+              <w:rPr>
+                <w:rFonts w:ascii="Arial" w:hAnsi="Arial"/>
+                <w:b w:val="0"/>
+                <w:sz w:val="14"/>
+              </w:rPr>
               <w:t>6.536</w:t>
             </w:r>
           </w:p>
         </w:tc>
         <w:tc>
           <w:tcPr>
-            <w:tcW w:type="dxa" w:w="1728"/>
+            <w:tcW w:type="dxa" w:w="2400"/>
           </w:tcPr>
           <w:p>
-            <w:pPr>
-              <w:jc w:val="right"/>
-            </w:pPr>
             <w:r>
               <w:rPr>
-                <w:b/>
+                <w:rFonts w:ascii="Arial" w:hAnsi="Arial"/>
+                <w:b w:val="0"/>
+                <w:sz w:val="14"/>
               </w:rPr>
-              <w:t>64.9%</w:t>
+            </w:r>
+            <w:r>
+              <w:rPr>
+                <w:rFonts w:ascii="Arial" w:hAnsi="Arial"/>
+                <w:b w:val="0"/>
+                <w:sz w:val="14"/>
+              </w:rPr>
+              <w:t>6.536</w:t>
             </w:r>
           </w:p>
         </w:tc>
         <w:tc>
           <w:tcPr>
-            <w:tcW w:type="dxa" w:w="1728"/>
+            <w:tcW w:type="dxa" w:w="2400"/>
           </w:tcPr>
           <w:p>
-            <w:pPr>
-              <w:jc w:val="right"/>
-            </w:pPr>
             <w:r>
-              <w:t>14/18</w:t>
+              <w:rPr>
+                <w:rFonts w:ascii="Arial" w:hAnsi="Arial"/>
+                <w:b w:val="0"/>
+                <w:sz w:val="14"/>
+              </w:rPr>
+            </w:r>
+            <w:r>
+              <w:rPr>
+                <w:rFonts w:ascii="Arial" w:hAnsi="Arial"/>
+                <w:b w:val="0"/>
+                <w:sz w:val="14"/>
+              </w:rPr>
+            </w:r>
+            <w:r>
+              <w:rPr>
+                <w:rFonts w:ascii="Arial" w:hAnsi="Arial"/>
+                <w:b/>
+                <w:i w:val="0"/>
+                <w:sz w:val="14"/>
+              </w:rPr>
+              <w:t>64.9%</w:t>
+            </w:r>
+            <w:r>
+              <w:rPr>
+                <w:rFonts w:ascii="Arial" w:hAnsi="Arial"/>
+                <w:b w:val="0"/>
+                <w:sz w:val="14"/>
+              </w:rPr>
             </w:r>
           </w:p>
         </w:tc>
       </w:tr>
     </w:tbl>
-    <w:p>
-      <w:pPr>
-        <w:spacing w:after="0"/>
-      </w:pPr>
-    </w:p>
     <w:tbl>
       <w:tblPr>
-        <w:tblStyle w:val="LightShading-Accent1"/>
+        <w:tblStyle w:val="TableGrid"/>
         <w:tblW w:type="auto" w:w="0"/>
         <w:tblLook w:firstColumn="1" w:firstRow="1" w:lastColumn="0" w:lastRow="0" w:noHBand="0" w:noVBand="1" w:val="04A0"/>
       </w:tblPr>
       <w:tblGrid>
-        <w:gridCol w:w="2074"/>
-        <w:gridCol w:w="2074"/>
-        <w:gridCol w:w="2074"/>
-        <w:gridCol w:w="2074"/>
-        <w:gridCol w:w="2074"/>
+        <w:gridCol w:w="2057"/>
+        <w:gridCol w:w="2057"/>
+        <w:gridCol w:w="2057"/>
+        <w:gridCol w:w="2057"/>
+        <w:gridCol w:w="2057"/>
+        <w:gridCol w:w="2057"/>
+        <w:gridCol w:w="2057"/>
       </w:tblGrid>
       <w:tr>
         <w:tc>
           <w:tcPr>
-            <w:tcW w:type="dxa" w:w="2074"/>
+            <w:tcW w:type="dxa" w:w="2057"/>
+            <w:shd w:fill="DBE5F1"/>
           </w:tcPr>
           <w:p>
             <w:r>
+              <w:rPr>
+                <w:rFonts w:ascii="Arial" w:hAnsi="Arial"/>
+                <w:b/>
+                <w:sz w:val="14"/>
+              </w:rPr>
+            </w:r>
+            <w:r>
+              <w:rPr>
+                <w:rFonts w:ascii="Arial" w:hAnsi="Arial"/>
+                <w:b/>
+                <w:sz w:val="14"/>
+              </w:rPr>
               <w:t>Decompression</w:t>
             </w:r>
           </w:p>
         </w:tc>
         <w:tc>
           <w:tcPr>
-            <w:tcW w:type="dxa" w:w="2074"/>
+            <w:tcW w:type="dxa" w:w="2057"/>
+            <w:shd w:fill="DBE5F1"/>
           </w:tcPr>
           <w:p>
             <w:r>
+              <w:rPr>
+                <w:rFonts w:ascii="Arial" w:hAnsi="Arial"/>
+                <w:b/>
+                <w:sz w:val="14"/>
+              </w:rPr>
+            </w:r>
+            <w:r>
+              <w:rPr>
+                <w:rFonts w:ascii="Arial" w:hAnsi="Arial"/>
+                <w:b/>
+                <w:sz w:val="14"/>
+              </w:rPr>
               <w:t>Cases</w:t>
             </w:r>
           </w:p>
         </w:tc>
         <w:tc>
           <w:tcPr>
-            <w:tcW w:type="dxa" w:w="2074"/>
+            <w:tcW w:type="dxa" w:w="2057"/>
+            <w:shd w:fill="DBE5F1"/>
           </w:tcPr>
           <w:p>
             <w:r>
+              <w:rPr>
+                <w:rFonts w:ascii="Arial" w:hAnsi="Arial"/>
+                <w:b/>
+                <w:sz w:val="14"/>
+              </w:rPr>
+            </w:r>
+            <w:r>
+              <w:rPr>
+                <w:rFonts w:ascii="Arial" w:hAnsi="Arial"/>
+                <w:b/>
+                <w:sz w:val="14"/>
+              </w:rPr>
               <w:t>PatchedDelta GB/s</w:t>
             </w:r>
           </w:p>
         </w:tc>
         <w:tc>
           <w:tcPr>
-            <w:tcW w:type="dxa" w:w="2074"/>
+            <w:tcW w:type="dxa" w:w="2057"/>
+            <w:shd w:fill="DBE5F1"/>
           </w:tcPr>
           <w:p>
             <w:r>
-              <w:t>DBPDelta GB/s</w:t>
+              <w:rPr>
+                <w:rFonts w:ascii="Arial" w:hAnsi="Arial"/>
+                <w:b/>
+                <w:sz w:val="14"/>
+              </w:rPr>
+            </w:r>
+            <w:r>
+              <w:rPr>
+                <w:rFonts w:ascii="Arial" w:hAnsi="Arial"/>
+                <w:b/>
+                <w:sz w:val="14"/>
+              </w:rPr>
+              <w:t>Baseline DBP GB/s</w:t>
             </w:r>
           </w:p>
         </w:tc>
         <w:tc>
           <w:tcPr>
-            <w:tcW w:type="dxa" w:w="2074"/>
+            <w:tcW w:type="dxa" w:w="2057"/>
+            <w:shd w:fill="DBE5F1"/>
           </w:tcPr>
           <w:p>
             <w:r>
-              <w:t>PatchedDelta speedup</w:t>
+              <w:rPr>
+                <w:rFonts w:ascii="Arial" w:hAnsi="Arial"/>
+                <w:b/>
+                <w:sz w:val="14"/>
+              </w:rPr>
+            </w:r>
+            <w:r>
+              <w:rPr>
+                <w:rFonts w:ascii="Arial" w:hAnsi="Arial"/>
+                <w:b/>
+                <w:sz w:val="14"/>
+              </w:rPr>
+              <w:t>Optimized DBP GB/s</w:t>
+            </w:r>
+          </w:p>
+        </w:tc>
+        <w:tc>
+          <w:tcPr>
+            <w:tcW w:type="dxa" w:w="2057"/>
+            <w:shd w:fill="DBE5F1"/>
+          </w:tcPr>
+          <w:p>
+            <w:r>
+              <w:rPr>
+                <w:rFonts w:ascii="Arial" w:hAnsi="Arial"/>
+                <w:b/>
+                <w:sz w:val="14"/>
+              </w:rPr>
+            </w:r>
+            <w:r>
+              <w:rPr>
+                <w:rFonts w:ascii="Arial" w:hAnsi="Arial"/>
+                <w:b/>
+                <w:sz w:val="14"/>
+              </w:rPr>
+              <w:t>Patched vs baseline</w:t>
+            </w:r>
+          </w:p>
+        </w:tc>
+        <w:tc>
+          <w:tcPr>
+            <w:tcW w:type="dxa" w:w="2057"/>
+            <w:shd w:fill="DBE5F1"/>
+          </w:tcPr>
+          <w:p>
+            <w:r>
+              <w:rPr>
+                <w:rFonts w:ascii="Arial" w:hAnsi="Arial"/>
+                <w:b/>
+                <w:sz w:val="14"/>
+              </w:rPr>
+            </w:r>
+            <w:r>
+              <w:rPr>
+                <w:rFonts w:ascii="Arial" w:hAnsi="Arial"/>
+                <w:b/>
+                <w:sz w:val="14"/>
+              </w:rPr>
+              <w:t>Patched vs optimized</w:t>
             </w:r>
           </w:p>
         </w:tc>
@@ -482,66 +892,170 @@
       <w:tr>
         <w:tc>
           <w:tcPr>
-            <w:tcW w:type="dxa" w:w="2074"/>
+            <w:tcW w:type="dxa" w:w="2057"/>
           </w:tcPr>
           <w:p>
             <w:r>
+              <w:rPr>
+                <w:rFonts w:ascii="Arial" w:hAnsi="Arial"/>
+                <w:b w:val="0"/>
+                <w:sz w:val="14"/>
+              </w:rPr>
+            </w:r>
+            <w:r>
+              <w:rPr>
+                <w:rFonts w:ascii="Arial" w:hAnsi="Arial"/>
+                <w:b w:val="0"/>
+                <w:sz w:val="14"/>
+              </w:rPr>
               <w:t>INT32</w:t>
             </w:r>
           </w:p>
         </w:tc>
         <w:tc>
           <w:tcPr>
-            <w:tcW w:type="dxa" w:w="2074"/>
+            <w:tcW w:type="dxa" w:w="2057"/>
           </w:tcPr>
           <w:p>
-            <w:pPr>
-              <w:jc w:val="right"/>
-            </w:pPr>
             <w:r>
+              <w:rPr>
+                <w:rFonts w:ascii="Arial" w:hAnsi="Arial"/>
+                <w:b w:val="0"/>
+                <w:sz w:val="14"/>
+              </w:rPr>
+            </w:r>
+            <w:r>
+              <w:rPr>
+                <w:rFonts w:ascii="Arial" w:hAnsi="Arial"/>
+                <w:b w:val="0"/>
+                <w:sz w:val="14"/>
+              </w:rPr>
               <w:t>9</w:t>
             </w:r>
           </w:p>
         </w:tc>
         <w:tc>
           <w:tcPr>
-            <w:tcW w:type="dxa" w:w="2074"/>
+            <w:tcW w:type="dxa" w:w="2057"/>
           </w:tcPr>
           <w:p>
-            <w:pPr>
-              <w:jc w:val="right"/>
-            </w:pPr>
             <w:r>
-              <w:t>7.450</w:t>
+              <w:rPr>
+                <w:rFonts w:ascii="Arial" w:hAnsi="Arial"/>
+                <w:b w:val="0"/>
+                <w:sz w:val="14"/>
+              </w:rPr>
+            </w:r>
+            <w:r>
+              <w:rPr>
+                <w:rFonts w:ascii="Arial" w:hAnsi="Arial"/>
+                <w:b w:val="0"/>
+                <w:sz w:val="14"/>
+              </w:rPr>
+              <w:t>7.481</w:t>
             </w:r>
           </w:p>
         </w:tc>
         <w:tc>
           <w:tcPr>
-            <w:tcW w:type="dxa" w:w="2074"/>
+            <w:tcW w:type="dxa" w:w="2057"/>
           </w:tcPr>
           <w:p>
-            <w:pPr>
-              <w:jc w:val="right"/>
-            </w:pPr>
             <w:r>
+              <w:rPr>
+                <w:rFonts w:ascii="Arial" w:hAnsi="Arial"/>
+                <w:b w:val="0"/>
+                <w:sz w:val="14"/>
+              </w:rPr>
+            </w:r>
+            <w:r>
+              <w:rPr>
+                <w:rFonts w:ascii="Arial" w:hAnsi="Arial"/>
+                <w:b w:val="0"/>
+                <w:sz w:val="14"/>
+              </w:rPr>
               <w:t>2.338</w:t>
             </w:r>
           </w:p>
         </w:tc>
         <w:tc>
           <w:tcPr>
-            <w:tcW w:type="dxa" w:w="2074"/>
+            <w:tcW w:type="dxa" w:w="2057"/>
           </w:tcPr>
           <w:p>
-            <w:pPr>
-              <w:jc w:val="right"/>
-            </w:pPr>
             <w:r>
               <w:rPr>
+                <w:rFonts w:ascii="Arial" w:hAnsi="Arial"/>
+                <w:b w:val="0"/>
+                <w:sz w:val="14"/>
+              </w:rPr>
+            </w:r>
+            <w:r>
+              <w:rPr>
+                <w:rFonts w:ascii="Arial" w:hAnsi="Arial"/>
+                <w:b w:val="0"/>
+                <w:sz w:val="14"/>
+              </w:rPr>
+              <w:t>4.338</w:t>
+            </w:r>
+          </w:p>
+        </w:tc>
+        <w:tc>
+          <w:tcPr>
+            <w:tcW w:type="dxa" w:w="2057"/>
+          </w:tcPr>
+          <w:p>
+            <w:r>
+              <w:rPr>
+                <w:rFonts w:ascii="Arial" w:hAnsi="Arial"/>
+                <w:b w:val="0"/>
+                <w:sz w:val="14"/>
+              </w:rPr>
+            </w:r>
+            <w:r>
+              <w:rPr>
+                <w:rFonts w:ascii="Arial" w:hAnsi="Arial"/>
+                <w:b w:val="0"/>
+                <w:sz w:val="14"/>
+              </w:rPr>
+              <w:t>3.20x</w:t>
+            </w:r>
+          </w:p>
+        </w:tc>
+        <w:tc>
+          <w:tcPr>
+            <w:tcW w:type="dxa" w:w="2057"/>
+          </w:tcPr>
+          <w:p>
+            <w:r>
+              <w:rPr>
+                <w:rFonts w:ascii="Arial" w:hAnsi="Arial"/>
+                <w:b w:val="0"/>
+                <w:sz w:val="14"/>
+              </w:rPr>
+            </w:r>
+            <w:r>
+              <w:rPr>
+                <w:rFonts w:ascii="Arial" w:hAnsi="Arial"/>
+                <w:b w:val="0"/>
+                <w:sz w:val="14"/>
+              </w:rPr>
+            </w:r>
+            <w:r>
+              <w:rPr>
+                <w:rFonts w:ascii="Arial" w:hAnsi="Arial"/>
                 <w:b/>
+                <w:i w:val="0"/>
+                <w:sz w:val="14"/>
               </w:rPr>
-              <w:t>3.19x</w:t>
+              <w:t>1.72x</w:t>
+            </w:r>
+            <w:r>
+              <w:rPr>
+                <w:rFonts w:ascii="Arial" w:hAnsi="Arial"/>
+                <w:b w:val="0"/>
+                <w:sz w:val="14"/>
+              </w:rPr>
             </w:r>
           </w:p>
         </w:tc>
@@ -549,66 +1063,170 @@
       <w:tr>
         <w:tc>
           <w:tcPr>
-            <w:tcW w:type="dxa" w:w="2074"/>
+            <w:tcW w:type="dxa" w:w="2057"/>
           </w:tcPr>
           <w:p>
             <w:r>
+              <w:rPr>
+                <w:rFonts w:ascii="Arial" w:hAnsi="Arial"/>
+                <w:b w:val="0"/>
+                <w:sz w:val="14"/>
+              </w:rPr>
+            </w:r>
+            <w:r>
+              <w:rPr>
+                <w:rFonts w:ascii="Arial" w:hAnsi="Arial"/>
+                <w:b w:val="0"/>
+                <w:sz w:val="14"/>
+              </w:rPr>
               <w:t>INT64</w:t>
             </w:r>
           </w:p>
         </w:tc>
         <w:tc>
           <w:tcPr>
-            <w:tcW w:type="dxa" w:w="2074"/>
+            <w:tcW w:type="dxa" w:w="2057"/>
           </w:tcPr>
           <w:p>
-            <w:pPr>
-              <w:jc w:val="right"/>
-            </w:pPr>
             <w:r>
+              <w:rPr>
+                <w:rFonts w:ascii="Arial" w:hAnsi="Arial"/>
+                <w:b w:val="0"/>
+                <w:sz w:val="14"/>
+              </w:rPr>
+            </w:r>
+            <w:r>
+              <w:rPr>
+                <w:rFonts w:ascii="Arial" w:hAnsi="Arial"/>
+                <w:b w:val="0"/>
+                <w:sz w:val="14"/>
+              </w:rPr>
               <w:t>9</w:t>
             </w:r>
           </w:p>
         </w:tc>
         <w:tc>
           <w:tcPr>
-            <w:tcW w:type="dxa" w:w="2074"/>
+            <w:tcW w:type="dxa" w:w="2057"/>
           </w:tcPr>
           <w:p>
-            <w:pPr>
-              <w:jc w:val="right"/>
-            </w:pPr>
             <w:r>
-              <w:t>12.912</w:t>
+              <w:rPr>
+                <w:rFonts w:ascii="Arial" w:hAnsi="Arial"/>
+                <w:b w:val="0"/>
+                <w:sz w:val="14"/>
+              </w:rPr>
+            </w:r>
+            <w:r>
+              <w:rPr>
+                <w:rFonts w:ascii="Arial" w:hAnsi="Arial"/>
+                <w:b w:val="0"/>
+                <w:sz w:val="14"/>
+              </w:rPr>
+              <w:t>12.976</w:t>
             </w:r>
           </w:p>
         </w:tc>
         <w:tc>
           <w:tcPr>
-            <w:tcW w:type="dxa" w:w="2074"/>
+            <w:tcW w:type="dxa" w:w="2057"/>
           </w:tcPr>
           <w:p>
-            <w:pPr>
-              <w:jc w:val="right"/>
-            </w:pPr>
             <w:r>
+              <w:rPr>
+                <w:rFonts w:ascii="Arial" w:hAnsi="Arial"/>
+                <w:b w:val="0"/>
+                <w:sz w:val="14"/>
+              </w:rPr>
+            </w:r>
+            <w:r>
+              <w:rPr>
+                <w:rFonts w:ascii="Arial" w:hAnsi="Arial"/>
+                <w:b w:val="0"/>
+                <w:sz w:val="14"/>
+              </w:rPr>
               <w:t>6.055</w:t>
             </w:r>
           </w:p>
         </w:tc>
         <w:tc>
           <w:tcPr>
-            <w:tcW w:type="dxa" w:w="2074"/>
+            <w:tcW w:type="dxa" w:w="2057"/>
           </w:tcPr>
           <w:p>
-            <w:pPr>
-              <w:jc w:val="right"/>
-            </w:pPr>
             <w:r>
               <w:rPr>
+                <w:rFonts w:ascii="Arial" w:hAnsi="Arial"/>
+                <w:b w:val="0"/>
+                <w:sz w:val="14"/>
+              </w:rPr>
+            </w:r>
+            <w:r>
+              <w:rPr>
+                <w:rFonts w:ascii="Arial" w:hAnsi="Arial"/>
+                <w:b w:val="0"/>
+                <w:sz w:val="14"/>
+              </w:rPr>
+              <w:t>8.198</w:t>
+            </w:r>
+          </w:p>
+        </w:tc>
+        <w:tc>
+          <w:tcPr>
+            <w:tcW w:type="dxa" w:w="2057"/>
+          </w:tcPr>
+          <w:p>
+            <w:r>
+              <w:rPr>
+                <w:rFonts w:ascii="Arial" w:hAnsi="Arial"/>
+                <w:b w:val="0"/>
+                <w:sz w:val="14"/>
+              </w:rPr>
+            </w:r>
+            <w:r>
+              <w:rPr>
+                <w:rFonts w:ascii="Arial" w:hAnsi="Arial"/>
+                <w:b w:val="0"/>
+                <w:sz w:val="14"/>
+              </w:rPr>
+              <w:t>2.14x</w:t>
+            </w:r>
+          </w:p>
+        </w:tc>
+        <w:tc>
+          <w:tcPr>
+            <w:tcW w:type="dxa" w:w="2057"/>
+          </w:tcPr>
+          <w:p>
+            <w:r>
+              <w:rPr>
+                <w:rFonts w:ascii="Arial" w:hAnsi="Arial"/>
+                <w:b w:val="0"/>
+                <w:sz w:val="14"/>
+              </w:rPr>
+            </w:r>
+            <w:r>
+              <w:rPr>
+                <w:rFonts w:ascii="Arial" w:hAnsi="Arial"/>
+                <w:b w:val="0"/>
+                <w:sz w:val="14"/>
+              </w:rPr>
+            </w:r>
+            <w:r>
+              <w:rPr>
+                <w:rFonts w:ascii="Arial" w:hAnsi="Arial"/>
                 <w:b/>
+                <w:i w:val="0"/>
+                <w:sz w:val="14"/>
               </w:rPr>
-              <w:t>2.13x</w:t>
+              <w:t>1.58x</w:t>
+            </w:r>
+            <w:r>
+              <w:rPr>
+                <w:rFonts w:ascii="Arial" w:hAnsi="Arial"/>
+                <w:b w:val="0"/>
+                <w:sz w:val="14"/>
+              </w:rPr>
             </w:r>
           </w:p>
         </w:tc>
@@ -616,76 +1234,175 @@
       <w:tr>
         <w:tc>
           <w:tcPr>
-            <w:tcW w:type="dxa" w:w="2074"/>
+            <w:tcW w:type="dxa" w:w="2057"/>
           </w:tcPr>
           <w:p>
             <w:r>
+              <w:rPr>
+                <w:rFonts w:ascii="Arial" w:hAnsi="Arial"/>
+                <w:b w:val="0"/>
+                <w:sz w:val="14"/>
+              </w:rPr>
+            </w:r>
+            <w:r>
+              <w:rPr>
+                <w:rFonts w:ascii="Arial" w:hAnsi="Arial"/>
+                <w:b w:val="0"/>
+                <w:sz w:val="14"/>
+              </w:rPr>
               <w:t>Combined</w:t>
             </w:r>
           </w:p>
         </w:tc>
         <w:tc>
           <w:tcPr>
-            <w:tcW w:type="dxa" w:w="2074"/>
+            <w:tcW w:type="dxa" w:w="2057"/>
           </w:tcPr>
           <w:p>
-            <w:pPr>
-              <w:jc w:val="right"/>
-            </w:pPr>
             <w:r>
+              <w:rPr>
+                <w:rFonts w:ascii="Arial" w:hAnsi="Arial"/>
+                <w:b w:val="0"/>
+                <w:sz w:val="14"/>
+              </w:rPr>
+            </w:r>
+            <w:r>
+              <w:rPr>
+                <w:rFonts w:ascii="Arial" w:hAnsi="Arial"/>
+                <w:b w:val="0"/>
+                <w:sz w:val="14"/>
+              </w:rPr>
               <w:t>18</w:t>
             </w:r>
           </w:p>
         </w:tc>
         <w:tc>
           <w:tcPr>
-            <w:tcW w:type="dxa" w:w="2074"/>
+            <w:tcW w:type="dxa" w:w="2057"/>
           </w:tcPr>
           <w:p>
-            <w:pPr>
-              <w:jc w:val="right"/>
-            </w:pPr>
             <w:r>
-              <w:t>9.808</w:t>
+              <w:rPr>
+                <w:rFonts w:ascii="Arial" w:hAnsi="Arial"/>
+                <w:b w:val="0"/>
+                <w:sz w:val="14"/>
+              </w:rPr>
+            </w:r>
+            <w:r>
+              <w:rPr>
+                <w:rFonts w:ascii="Arial" w:hAnsi="Arial"/>
+                <w:b w:val="0"/>
+                <w:sz w:val="14"/>
+              </w:rPr>
+              <w:t>9.852</w:t>
             </w:r>
           </w:p>
         </w:tc>
         <w:tc>
           <w:tcPr>
-            <w:tcW w:type="dxa" w:w="2074"/>
+            <w:tcW w:type="dxa" w:w="2057"/>
           </w:tcPr>
           <w:p>
-            <w:pPr>
-              <w:jc w:val="right"/>
-            </w:pPr>
             <w:r>
+              <w:rPr>
+                <w:rFonts w:ascii="Arial" w:hAnsi="Arial"/>
+                <w:b w:val="0"/>
+                <w:sz w:val="14"/>
+              </w:rPr>
+            </w:r>
+            <w:r>
+              <w:rPr>
+                <w:rFonts w:ascii="Arial" w:hAnsi="Arial"/>
+                <w:b w:val="0"/>
+                <w:sz w:val="14"/>
+              </w:rPr>
               <w:t>3.763</w:t>
             </w:r>
           </w:p>
         </w:tc>
         <w:tc>
           <w:tcPr>
-            <w:tcW w:type="dxa" w:w="2074"/>
+            <w:tcW w:type="dxa" w:w="2057"/>
           </w:tcPr>
           <w:p>
-            <w:pPr>
-              <w:jc w:val="right"/>
-            </w:pPr>
             <w:r>
               <w:rPr>
+                <w:rFonts w:ascii="Arial" w:hAnsi="Arial"/>
+                <w:b w:val="0"/>
+                <w:sz w:val="14"/>
+              </w:rPr>
+            </w:r>
+            <w:r>
+              <w:rPr>
+                <w:rFonts w:ascii="Arial" w:hAnsi="Arial"/>
+                <w:b w:val="0"/>
+                <w:sz w:val="14"/>
+              </w:rPr>
+              <w:t>5.964</w:t>
+            </w:r>
+          </w:p>
+        </w:tc>
+        <w:tc>
+          <w:tcPr>
+            <w:tcW w:type="dxa" w:w="2057"/>
+          </w:tcPr>
+          <w:p>
+            <w:r>
+              <w:rPr>
+                <w:rFonts w:ascii="Arial" w:hAnsi="Arial"/>
+                <w:b w:val="0"/>
+                <w:sz w:val="14"/>
+              </w:rPr>
+            </w:r>
+            <w:r>
+              <w:rPr>
+                <w:rFonts w:ascii="Arial" w:hAnsi="Arial"/>
+                <w:b w:val="0"/>
+                <w:sz w:val="14"/>
+              </w:rPr>
+              <w:t>2.62x</w:t>
+            </w:r>
+          </w:p>
+        </w:tc>
+        <w:tc>
+          <w:tcPr>
+            <w:tcW w:type="dxa" w:w="2057"/>
+          </w:tcPr>
+          <w:p>
+            <w:r>
+              <w:rPr>
+                <w:rFonts w:ascii="Arial" w:hAnsi="Arial"/>
+                <w:b w:val="0"/>
+                <w:sz w:val="14"/>
+              </w:rPr>
+            </w:r>
+            <w:r>
+              <w:rPr>
+                <w:rFonts w:ascii="Arial" w:hAnsi="Arial"/>
+                <w:b w:val="0"/>
+                <w:sz w:val="14"/>
+              </w:rPr>
+            </w:r>
+            <w:r>
+              <w:rPr>
+                <w:rFonts w:ascii="Arial" w:hAnsi="Arial"/>
                 <w:b/>
+                <w:i w:val="0"/>
+                <w:sz w:val="14"/>
               </w:rPr>
-              <w:t>2.61x</w:t>
+              <w:t>1.65x</w:t>
+            </w:r>
+            <w:r>
+              <w:rPr>
+                <w:rFonts w:ascii="Arial" w:hAnsi="Arial"/>
+                <w:b w:val="0"/>
+                <w:sz w:val="14"/>
+              </w:rPr>
             </w:r>
           </w:p>
         </w:tc>
       </w:tr>
     </w:tbl>
-    <w:p>
-      <w:pPr>
-        <w:spacing w:after="0"/>
-      </w:pPr>
-    </w:p>
     <w:p>
       <w:pPr>
         <w:pStyle w:val="Heading1"/>
@@ -696,76 +1413,154 @@
     </w:p>
     <w:tbl>
       <w:tblPr>
-        <w:tblStyle w:val="LightShading-Accent1"/>
+        <w:tblStyle w:val="TableGrid"/>
         <w:tblW w:type="auto" w:w="0"/>
         <w:tblLook w:firstColumn="1" w:firstRow="1" w:lastColumn="0" w:lastRow="0" w:noHBand="0" w:noVBand="1" w:val="04A0"/>
       </w:tblPr>
       <w:tblGrid>
-        <w:gridCol w:w="1728"/>
-        <w:gridCol w:w="1728"/>
-        <w:gridCol w:w="1728"/>
-        <w:gridCol w:w="1728"/>
-        <w:gridCol w:w="1728"/>
-        <w:gridCol w:w="1728"/>
+        <w:gridCol w:w="2400"/>
+        <w:gridCol w:w="2400"/>
+        <w:gridCol w:w="2400"/>
+        <w:gridCol w:w="2400"/>
+        <w:gridCol w:w="2400"/>
+        <w:gridCol w:w="2400"/>
       </w:tblGrid>
       <w:tr>
         <w:tc>
           <w:tcPr>
-            <w:tcW w:type="dxa" w:w="1728"/>
+            <w:tcW w:type="dxa" w:w="2400"/>
+            <w:shd w:fill="DBE5F1"/>
           </w:tcPr>
           <w:p>
             <w:r>
+              <w:rPr>
+                <w:rFonts w:ascii="Arial" w:hAnsi="Arial"/>
+                <w:b/>
+                <w:sz w:val="14"/>
+              </w:rPr>
+            </w:r>
+            <w:r>
+              <w:rPr>
+                <w:rFonts w:ascii="Arial" w:hAnsi="Arial"/>
+                <w:b/>
+                <w:sz w:val="14"/>
+              </w:rPr>
               <w:t>Compression</w:t>
             </w:r>
           </w:p>
         </w:tc>
         <w:tc>
           <w:tcPr>
-            <w:tcW w:type="dxa" w:w="1728"/>
+            <w:tcW w:type="dxa" w:w="2400"/>
+            <w:shd w:fill="DBE5F1"/>
           </w:tcPr>
           <w:p>
             <w:r>
+              <w:rPr>
+                <w:rFonts w:ascii="Arial" w:hAnsi="Arial"/>
+                <w:b/>
+                <w:sz w:val="14"/>
+              </w:rPr>
+            </w:r>
+            <w:r>
+              <w:rPr>
+                <w:rFonts w:ascii="Arial" w:hAnsi="Arial"/>
+                <w:b/>
+                <w:sz w:val="14"/>
+              </w:rPr>
               <w:t>Cases</w:t>
             </w:r>
           </w:p>
         </w:tc>
         <w:tc>
           <w:tcPr>
-            <w:tcW w:type="dxa" w:w="1728"/>
+            <w:tcW w:type="dxa" w:w="2400"/>
+            <w:shd w:fill="DBE5F1"/>
           </w:tcPr>
           <w:p>
             <w:r>
+              <w:rPr>
+                <w:rFonts w:ascii="Arial" w:hAnsi="Arial"/>
+                <w:b/>
+                <w:sz w:val="14"/>
+              </w:rPr>
+            </w:r>
+            <w:r>
+              <w:rPr>
+                <w:rFonts w:ascii="Arial" w:hAnsi="Arial"/>
+                <w:b/>
+                <w:sz w:val="14"/>
+              </w:rPr>
               <w:t>PatchedDelta ratio</w:t>
             </w:r>
           </w:p>
         </w:tc>
         <w:tc>
           <w:tcPr>
-            <w:tcW w:type="dxa" w:w="1728"/>
+            <w:tcW w:type="dxa" w:w="2400"/>
+            <w:shd w:fill="DBE5F1"/>
           </w:tcPr>
           <w:p>
             <w:r>
-              <w:t>DBPDelta ratio</w:t>
+              <w:rPr>
+                <w:rFonts w:ascii="Arial" w:hAnsi="Arial"/>
+                <w:b/>
+                <w:sz w:val="14"/>
+              </w:rPr>
+            </w:r>
+            <w:r>
+              <w:rPr>
+                <w:rFonts w:ascii="Arial" w:hAnsi="Arial"/>
+                <w:b/>
+                <w:sz w:val="14"/>
+              </w:rPr>
+              <w:t>Baseline DBP ratio</w:t>
             </w:r>
           </w:p>
         </w:tc>
         <w:tc>
           <w:tcPr>
-            <w:tcW w:type="dxa" w:w="1728"/>
+            <w:tcW w:type="dxa" w:w="2400"/>
+            <w:shd w:fill="DBE5F1"/>
           </w:tcPr>
           <w:p>
             <w:r>
-              <w:t>PatchedDelta size vs DBP</w:t>
+              <w:rPr>
+                <w:rFonts w:ascii="Arial" w:hAnsi="Arial"/>
+                <w:b/>
+                <w:sz w:val="14"/>
+              </w:rPr>
+            </w:r>
+            <w:r>
+              <w:rPr>
+                <w:rFonts w:ascii="Arial" w:hAnsi="Arial"/>
+                <w:b/>
+                <w:sz w:val="14"/>
+              </w:rPr>
+              <w:t>Optimized DBP ratio</w:t>
             </w:r>
           </w:p>
         </w:tc>
         <w:tc>
           <w:tcPr>
-            <w:tcW w:type="dxa" w:w="1728"/>
+            <w:tcW w:type="dxa" w:w="2400"/>
+            <w:shd w:fill="DBE5F1"/>
           </w:tcPr>
           <w:p>
             <w:r>
-              <w:t>Size wins</w:t>
+              <w:rPr>
+                <w:rFonts w:ascii="Arial" w:hAnsi="Arial"/>
+                <w:b/>
+                <w:sz w:val="14"/>
+              </w:rPr>
+            </w:r>
+            <w:r>
+              <w:rPr>
+                <w:rFonts w:ascii="Arial" w:hAnsi="Arial"/>
+                <w:b/>
+                <w:sz w:val="14"/>
+              </w:rPr>
+              <w:t>Patched size vs DBP</w:t>
             </w:r>
           </w:p>
         </w:tc>
@@ -773,76 +1568,133 @@
       <w:tr>
         <w:tc>
           <w:tcPr>
-            <w:tcW w:type="dxa" w:w="1728"/>
+            <w:tcW w:type="dxa" w:w="2400"/>
           </w:tcPr>
           <w:p>
             <w:r>
+              <w:rPr>
+                <w:rFonts w:ascii="Arial" w:hAnsi="Arial"/>
+                <w:b w:val="0"/>
+                <w:sz w:val="14"/>
+              </w:rPr>
+            </w:r>
+            <w:r>
+              <w:rPr>
+                <w:rFonts w:ascii="Arial" w:hAnsi="Arial"/>
+                <w:b w:val="0"/>
+                <w:sz w:val="14"/>
+              </w:rPr>
               <w:t>INT32</w:t>
             </w:r>
           </w:p>
         </w:tc>
         <w:tc>
           <w:tcPr>
-            <w:tcW w:type="dxa" w:w="1728"/>
+            <w:tcW w:type="dxa" w:w="2400"/>
           </w:tcPr>
           <w:p>
-            <w:pPr>
-              <w:jc w:val="right"/>
-            </w:pPr>
             <w:r>
+              <w:rPr>
+                <w:rFonts w:ascii="Arial" w:hAnsi="Arial"/>
+                <w:b w:val="0"/>
+                <w:sz w:val="14"/>
+              </w:rPr>
+            </w:r>
+            <w:r>
+              <w:rPr>
+                <w:rFonts w:ascii="Arial" w:hAnsi="Arial"/>
+                <w:b w:val="0"/>
+                <w:sz w:val="14"/>
+              </w:rPr>
               <w:t>30</w:t>
             </w:r>
           </w:p>
         </w:tc>
         <w:tc>
           <w:tcPr>
-            <w:tcW w:type="dxa" w:w="1728"/>
+            <w:tcW w:type="dxa" w:w="2400"/>
           </w:tcPr>
           <w:p>
-            <w:pPr>
-              <w:jc w:val="right"/>
-            </w:pPr>
             <w:r>
+              <w:rPr>
+                <w:rFonts w:ascii="Arial" w:hAnsi="Arial"/>
+                <w:b w:val="0"/>
+                <w:sz w:val="14"/>
+              </w:rPr>
+            </w:r>
+            <w:r>
+              <w:rPr>
+                <w:rFonts w:ascii="Arial" w:hAnsi="Arial"/>
+                <w:b w:val="0"/>
+                <w:sz w:val="14"/>
+              </w:rPr>
               <w:t>2.999</w:t>
             </w:r>
           </w:p>
         </w:tc>
         <w:tc>
           <w:tcPr>
-            <w:tcW w:type="dxa" w:w="1728"/>
+            <w:tcW w:type="dxa" w:w="2400"/>
           </w:tcPr>
           <w:p>
-            <w:pPr>
-              <w:jc w:val="right"/>
-            </w:pPr>
             <w:r>
+              <w:rPr>
+                <w:rFonts w:ascii="Arial" w:hAnsi="Arial"/>
+                <w:b w:val="0"/>
+                <w:sz w:val="14"/>
+              </w:rPr>
+            </w:r>
+            <w:r>
+              <w:rPr>
+                <w:rFonts w:ascii="Arial" w:hAnsi="Arial"/>
+                <w:b w:val="0"/>
+                <w:sz w:val="14"/>
+              </w:rPr>
               <w:t>2.927</w:t>
             </w:r>
           </w:p>
         </w:tc>
         <w:tc>
           <w:tcPr>
-            <w:tcW w:type="dxa" w:w="1728"/>
+            <w:tcW w:type="dxa" w:w="2400"/>
           </w:tcPr>
           <w:p>
-            <w:pPr>
-              <w:jc w:val="right"/>
-            </w:pPr>
             <w:r>
-              <w:t>97.6%</w:t>
+              <w:rPr>
+                <w:rFonts w:ascii="Arial" w:hAnsi="Arial"/>
+                <w:b w:val="0"/>
+                <w:sz w:val="14"/>
+              </w:rPr>
+            </w:r>
+            <w:r>
+              <w:rPr>
+                <w:rFonts w:ascii="Arial" w:hAnsi="Arial"/>
+                <w:b w:val="0"/>
+                <w:sz w:val="14"/>
+              </w:rPr>
+              <w:t>2.927</w:t>
             </w:r>
           </w:p>
         </w:tc>
         <w:tc>
           <w:tcPr>
-            <w:tcW w:type="dxa" w:w="1728"/>
+            <w:tcW w:type="dxa" w:w="2400"/>
           </w:tcPr>
           <w:p>
-            <w:pPr>
-              <w:jc w:val="right"/>
-            </w:pPr>
             <w:r>
-              <w:t>29/30</w:t>
+              <w:rPr>
+                <w:rFonts w:ascii="Arial" w:hAnsi="Arial"/>
+                <w:b w:val="0"/>
+                <w:sz w:val="14"/>
+              </w:rPr>
+            </w:r>
+            <w:r>
+              <w:rPr>
+                <w:rFonts w:ascii="Arial" w:hAnsi="Arial"/>
+                <w:b w:val="0"/>
+                <w:sz w:val="14"/>
+              </w:rPr>
+              <w:t>97.6%</w:t>
             </w:r>
           </w:p>
         </w:tc>
@@ -850,76 +1702,133 @@
       <w:tr>
         <w:tc>
           <w:tcPr>
-            <w:tcW w:type="dxa" w:w="1728"/>
+            <w:tcW w:type="dxa" w:w="2400"/>
           </w:tcPr>
           <w:p>
             <w:r>
+              <w:rPr>
+                <w:rFonts w:ascii="Arial" w:hAnsi="Arial"/>
+                <w:b w:val="0"/>
+                <w:sz w:val="14"/>
+              </w:rPr>
+            </w:r>
+            <w:r>
+              <w:rPr>
+                <w:rFonts w:ascii="Arial" w:hAnsi="Arial"/>
+                <w:b w:val="0"/>
+                <w:sz w:val="14"/>
+              </w:rPr>
               <w:t>INT64</w:t>
             </w:r>
           </w:p>
         </w:tc>
         <w:tc>
           <w:tcPr>
-            <w:tcW w:type="dxa" w:w="1728"/>
+            <w:tcW w:type="dxa" w:w="2400"/>
           </w:tcPr>
           <w:p>
-            <w:pPr>
-              <w:jc w:val="right"/>
-            </w:pPr>
             <w:r>
+              <w:rPr>
+                <w:rFonts w:ascii="Arial" w:hAnsi="Arial"/>
+                <w:b w:val="0"/>
+                <w:sz w:val="14"/>
+              </w:rPr>
+            </w:r>
+            <w:r>
+              <w:rPr>
+                <w:rFonts w:ascii="Arial" w:hAnsi="Arial"/>
+                <w:b w:val="0"/>
+                <w:sz w:val="14"/>
+              </w:rPr>
               <w:t>6</w:t>
             </w:r>
           </w:p>
         </w:tc>
         <w:tc>
           <w:tcPr>
-            <w:tcW w:type="dxa" w:w="1728"/>
+            <w:tcW w:type="dxa" w:w="2400"/>
           </w:tcPr>
           <w:p>
-            <w:pPr>
-              <w:jc w:val="right"/>
-            </w:pPr>
             <w:r>
+              <w:rPr>
+                <w:rFonts w:ascii="Arial" w:hAnsi="Arial"/>
+                <w:b w:val="0"/>
+                <w:sz w:val="14"/>
+              </w:rPr>
+            </w:r>
+            <w:r>
+              <w:rPr>
+                <w:rFonts w:ascii="Arial" w:hAnsi="Arial"/>
+                <w:b w:val="0"/>
+                <w:sz w:val="14"/>
+              </w:rPr>
               <w:t>2.113</w:t>
             </w:r>
           </w:p>
         </w:tc>
         <w:tc>
           <w:tcPr>
-            <w:tcW w:type="dxa" w:w="1728"/>
+            <w:tcW w:type="dxa" w:w="2400"/>
           </w:tcPr>
           <w:p>
-            <w:pPr>
-              <w:jc w:val="right"/>
-            </w:pPr>
             <w:r>
+              <w:rPr>
+                <w:rFonts w:ascii="Arial" w:hAnsi="Arial"/>
+                <w:b w:val="0"/>
+                <w:sz w:val="14"/>
+              </w:rPr>
+            </w:r>
+            <w:r>
+              <w:rPr>
+                <w:rFonts w:ascii="Arial" w:hAnsi="Arial"/>
+                <w:b w:val="0"/>
+                <w:sz w:val="14"/>
+              </w:rPr>
               <w:t>2.107</w:t>
             </w:r>
           </w:p>
         </w:tc>
         <w:tc>
           <w:tcPr>
-            <w:tcW w:type="dxa" w:w="1728"/>
+            <w:tcW w:type="dxa" w:w="2400"/>
           </w:tcPr>
           <w:p>
-            <w:pPr>
-              <w:jc w:val="right"/>
-            </w:pPr>
             <w:r>
-              <w:t>99.7%</w:t>
+              <w:rPr>
+                <w:rFonts w:ascii="Arial" w:hAnsi="Arial"/>
+                <w:b w:val="0"/>
+                <w:sz w:val="14"/>
+              </w:rPr>
+            </w:r>
+            <w:r>
+              <w:rPr>
+                <w:rFonts w:ascii="Arial" w:hAnsi="Arial"/>
+                <w:b w:val="0"/>
+                <w:sz w:val="14"/>
+              </w:rPr>
+              <w:t>2.107</w:t>
             </w:r>
           </w:p>
         </w:tc>
         <w:tc>
           <w:tcPr>
-            <w:tcW w:type="dxa" w:w="1728"/>
+            <w:tcW w:type="dxa" w:w="2400"/>
           </w:tcPr>
           <w:p>
-            <w:pPr>
-              <w:jc w:val="right"/>
-            </w:pPr>
             <w:r>
-              <w:t>5/6</w:t>
+              <w:rPr>
+                <w:rFonts w:ascii="Arial" w:hAnsi="Arial"/>
+                <w:b w:val="0"/>
+                <w:sz w:val="14"/>
+              </w:rPr>
+            </w:r>
+            <w:r>
+              <w:rPr>
+                <w:rFonts w:ascii="Arial" w:hAnsi="Arial"/>
+                <w:b w:val="0"/>
+                <w:sz w:val="14"/>
+              </w:rPr>
+              <w:t>99.7%</w:t>
             </w:r>
           </w:p>
         </w:tc>
@@ -927,79 +1836,840 @@
       <w:tr>
         <w:tc>
           <w:tcPr>
-            <w:tcW w:type="dxa" w:w="1728"/>
+            <w:tcW w:type="dxa" w:w="2400"/>
           </w:tcPr>
           <w:p>
             <w:r>
+              <w:rPr>
+                <w:rFonts w:ascii="Arial" w:hAnsi="Arial"/>
+                <w:b w:val="0"/>
+                <w:sz w:val="14"/>
+              </w:rPr>
+            </w:r>
+            <w:r>
+              <w:rPr>
+                <w:rFonts w:ascii="Arial" w:hAnsi="Arial"/>
+                <w:b w:val="0"/>
+                <w:sz w:val="14"/>
+              </w:rPr>
               <w:t>Combined</w:t>
             </w:r>
           </w:p>
         </w:tc>
         <w:tc>
           <w:tcPr>
-            <w:tcW w:type="dxa" w:w="1728"/>
+            <w:tcW w:type="dxa" w:w="2400"/>
           </w:tcPr>
           <w:p>
-            <w:pPr>
-              <w:jc w:val="right"/>
-            </w:pPr>
             <w:r>
+              <w:rPr>
+                <w:rFonts w:ascii="Arial" w:hAnsi="Arial"/>
+                <w:b w:val="0"/>
+                <w:sz w:val="14"/>
+              </w:rPr>
+            </w:r>
+            <w:r>
+              <w:rPr>
+                <w:rFonts w:ascii="Arial" w:hAnsi="Arial"/>
+                <w:b w:val="0"/>
+                <w:sz w:val="14"/>
+              </w:rPr>
               <w:t>36</w:t>
             </w:r>
           </w:p>
         </w:tc>
         <w:tc>
           <w:tcPr>
-            <w:tcW w:type="dxa" w:w="1728"/>
+            <w:tcW w:type="dxa" w:w="2400"/>
           </w:tcPr>
           <w:p>
-            <w:pPr>
-              <w:jc w:val="right"/>
-            </w:pPr>
             <w:r>
+              <w:rPr>
+                <w:rFonts w:ascii="Arial" w:hAnsi="Arial"/>
+                <w:b w:val="0"/>
+                <w:sz w:val="14"/>
+              </w:rPr>
+            </w:r>
+            <w:r>
+              <w:rPr>
+                <w:rFonts w:ascii="Arial" w:hAnsi="Arial"/>
+                <w:b w:val="0"/>
+                <w:sz w:val="14"/>
+              </w:rPr>
               <w:t>2.829</w:t>
             </w:r>
           </w:p>
         </w:tc>
         <w:tc>
           <w:tcPr>
-            <w:tcW w:type="dxa" w:w="1728"/>
+            <w:tcW w:type="dxa" w:w="2400"/>
           </w:tcPr>
           <w:p>
-            <w:pPr>
-              <w:jc w:val="right"/>
-            </w:pPr>
             <w:r>
+              <w:rPr>
+                <w:rFonts w:ascii="Arial" w:hAnsi="Arial"/>
+                <w:b w:val="0"/>
+                <w:sz w:val="14"/>
+              </w:rPr>
+            </w:r>
+            <w:r>
+              <w:rPr>
+                <w:rFonts w:ascii="Arial" w:hAnsi="Arial"/>
+                <w:b w:val="0"/>
+                <w:sz w:val="14"/>
+              </w:rPr>
               <w:t>2.771</w:t>
             </w:r>
           </w:p>
         </w:tc>
         <w:tc>
           <w:tcPr>
-            <w:tcW w:type="dxa" w:w="1728"/>
+            <w:tcW w:type="dxa" w:w="2400"/>
           </w:tcPr>
           <w:p>
-            <w:pPr>
-              <w:jc w:val="right"/>
-            </w:pPr>
             <w:r>
               <w:rPr>
-                <w:b/>
+                <w:rFonts w:ascii="Arial" w:hAnsi="Arial"/>
+                <w:b w:val="0"/>
+                <w:sz w:val="14"/>
               </w:rPr>
-              <w:t>97.9%</w:t>
+            </w:r>
+            <w:r>
+              <w:rPr>
+                <w:rFonts w:ascii="Arial" w:hAnsi="Arial"/>
+                <w:b w:val="0"/>
+                <w:sz w:val="14"/>
+              </w:rPr>
+              <w:t>2.771</w:t>
             </w:r>
           </w:p>
         </w:tc>
         <w:tc>
           <w:tcPr>
-            <w:tcW w:type="dxa" w:w="1728"/>
+            <w:tcW w:type="dxa" w:w="2400"/>
           </w:tcPr>
           <w:p>
-            <w:pPr>
-              <w:jc w:val="right"/>
-            </w:pPr>
             <w:r>
-              <w:t>34/36</w:t>
+              <w:rPr>
+                <w:rFonts w:ascii="Arial" w:hAnsi="Arial"/>
+                <w:b w:val="0"/>
+                <w:sz w:val="14"/>
+              </w:rPr>
+            </w:r>
+            <w:r>
+              <w:rPr>
+                <w:rFonts w:ascii="Arial" w:hAnsi="Arial"/>
+                <w:b w:val="0"/>
+                <w:sz w:val="14"/>
+              </w:rPr>
+            </w:r>
+            <w:r>
+              <w:rPr>
+                <w:rFonts w:ascii="Arial" w:hAnsi="Arial"/>
+                <w:b/>
+                <w:i w:val="0"/>
+                <w:sz w:val="14"/>
+              </w:rPr>
+              <w:t>97.9%</w:t>
+            </w:r>
+            <w:r>
+              <w:rPr>
+                <w:rFonts w:ascii="Arial" w:hAnsi="Arial"/>
+                <w:b w:val="0"/>
+                <w:sz w:val="14"/>
+              </w:rPr>
+            </w:r>
+          </w:p>
+        </w:tc>
+      </w:tr>
+    </w:tbl>
+    <w:tbl>
+      <w:tblPr>
+        <w:tblStyle w:val="TableGrid"/>
+        <w:tblW w:type="auto" w:w="0"/>
+        <w:tblLook w:firstColumn="1" w:firstRow="1" w:lastColumn="0" w:lastRow="0" w:noHBand="0" w:noVBand="1" w:val="04A0"/>
+      </w:tblPr>
+      <w:tblGrid>
+        <w:gridCol w:w="2057"/>
+        <w:gridCol w:w="2057"/>
+        <w:gridCol w:w="2057"/>
+        <w:gridCol w:w="2057"/>
+        <w:gridCol w:w="2057"/>
+        <w:gridCol w:w="2057"/>
+        <w:gridCol w:w="2057"/>
+      </w:tblGrid>
+      <w:tr>
+        <w:tc>
+          <w:tcPr>
+            <w:tcW w:type="dxa" w:w="2057"/>
+            <w:shd w:fill="DBE5F1"/>
+          </w:tcPr>
+          <w:p>
+            <w:r>
+              <w:rPr>
+                <w:rFonts w:ascii="Arial" w:hAnsi="Arial"/>
+                <w:b/>
+                <w:sz w:val="14"/>
+              </w:rPr>
+            </w:r>
+            <w:r>
+              <w:rPr>
+                <w:rFonts w:ascii="Arial" w:hAnsi="Arial"/>
+                <w:b/>
+                <w:sz w:val="14"/>
+              </w:rPr>
+              <w:t>Decompression</w:t>
+            </w:r>
+          </w:p>
+        </w:tc>
+        <w:tc>
+          <w:tcPr>
+            <w:tcW w:type="dxa" w:w="2057"/>
+            <w:shd w:fill="DBE5F1"/>
+          </w:tcPr>
+          <w:p>
+            <w:r>
+              <w:rPr>
+                <w:rFonts w:ascii="Arial" w:hAnsi="Arial"/>
+                <w:b/>
+                <w:sz w:val="14"/>
+              </w:rPr>
+            </w:r>
+            <w:r>
+              <w:rPr>
+                <w:rFonts w:ascii="Arial" w:hAnsi="Arial"/>
+                <w:b/>
+                <w:sz w:val="14"/>
+              </w:rPr>
+              <w:t>Cases</w:t>
+            </w:r>
+          </w:p>
+        </w:tc>
+        <w:tc>
+          <w:tcPr>
+            <w:tcW w:type="dxa" w:w="2057"/>
+            <w:shd w:fill="DBE5F1"/>
+          </w:tcPr>
+          <w:p>
+            <w:r>
+              <w:rPr>
+                <w:rFonts w:ascii="Arial" w:hAnsi="Arial"/>
+                <w:b/>
+                <w:sz w:val="14"/>
+              </w:rPr>
+            </w:r>
+            <w:r>
+              <w:rPr>
+                <w:rFonts w:ascii="Arial" w:hAnsi="Arial"/>
+                <w:b/>
+                <w:sz w:val="14"/>
+              </w:rPr>
+              <w:t>PatchedDelta GB/s</w:t>
+            </w:r>
+          </w:p>
+        </w:tc>
+        <w:tc>
+          <w:tcPr>
+            <w:tcW w:type="dxa" w:w="2057"/>
+            <w:shd w:fill="DBE5F1"/>
+          </w:tcPr>
+          <w:p>
+            <w:r>
+              <w:rPr>
+                <w:rFonts w:ascii="Arial" w:hAnsi="Arial"/>
+                <w:b/>
+                <w:sz w:val="14"/>
+              </w:rPr>
+            </w:r>
+            <w:r>
+              <w:rPr>
+                <w:rFonts w:ascii="Arial" w:hAnsi="Arial"/>
+                <w:b/>
+                <w:sz w:val="14"/>
+              </w:rPr>
+              <w:t>Baseline DBP GB/s</w:t>
+            </w:r>
+          </w:p>
+        </w:tc>
+        <w:tc>
+          <w:tcPr>
+            <w:tcW w:type="dxa" w:w="2057"/>
+            <w:shd w:fill="DBE5F1"/>
+          </w:tcPr>
+          <w:p>
+            <w:r>
+              <w:rPr>
+                <w:rFonts w:ascii="Arial" w:hAnsi="Arial"/>
+                <w:b/>
+                <w:sz w:val="14"/>
+              </w:rPr>
+            </w:r>
+            <w:r>
+              <w:rPr>
+                <w:rFonts w:ascii="Arial" w:hAnsi="Arial"/>
+                <w:b/>
+                <w:sz w:val="14"/>
+              </w:rPr>
+              <w:t>Optimized DBP GB/s</w:t>
+            </w:r>
+          </w:p>
+        </w:tc>
+        <w:tc>
+          <w:tcPr>
+            <w:tcW w:type="dxa" w:w="2057"/>
+            <w:shd w:fill="DBE5F1"/>
+          </w:tcPr>
+          <w:p>
+            <w:r>
+              <w:rPr>
+                <w:rFonts w:ascii="Arial" w:hAnsi="Arial"/>
+                <w:b/>
+                <w:sz w:val="14"/>
+              </w:rPr>
+            </w:r>
+            <w:r>
+              <w:rPr>
+                <w:rFonts w:ascii="Arial" w:hAnsi="Arial"/>
+                <w:b/>
+                <w:sz w:val="14"/>
+              </w:rPr>
+              <w:t>Patched vs baseline</w:t>
+            </w:r>
+          </w:p>
+        </w:tc>
+        <w:tc>
+          <w:tcPr>
+            <w:tcW w:type="dxa" w:w="2057"/>
+            <w:shd w:fill="DBE5F1"/>
+          </w:tcPr>
+          <w:p>
+            <w:r>
+              <w:rPr>
+                <w:rFonts w:ascii="Arial" w:hAnsi="Arial"/>
+                <w:b/>
+                <w:sz w:val="14"/>
+              </w:rPr>
+            </w:r>
+            <w:r>
+              <w:rPr>
+                <w:rFonts w:ascii="Arial" w:hAnsi="Arial"/>
+                <w:b/>
+                <w:sz w:val="14"/>
+              </w:rPr>
+              <w:t>Patched vs optimized</w:t>
+            </w:r>
+          </w:p>
+        </w:tc>
+      </w:tr>
+      <w:tr>
+        <w:tc>
+          <w:tcPr>
+            <w:tcW w:type="dxa" w:w="2057"/>
+          </w:tcPr>
+          <w:p>
+            <w:r>
+              <w:rPr>
+                <w:rFonts w:ascii="Arial" w:hAnsi="Arial"/>
+                <w:b w:val="0"/>
+                <w:sz w:val="14"/>
+              </w:rPr>
+            </w:r>
+            <w:r>
+              <w:rPr>
+                <w:rFonts w:ascii="Arial" w:hAnsi="Arial"/>
+                <w:b w:val="0"/>
+                <w:sz w:val="14"/>
+              </w:rPr>
+              <w:t>INT32</w:t>
+            </w:r>
+          </w:p>
+        </w:tc>
+        <w:tc>
+          <w:tcPr>
+            <w:tcW w:type="dxa" w:w="2057"/>
+          </w:tcPr>
+          <w:p>
+            <w:r>
+              <w:rPr>
+                <w:rFonts w:ascii="Arial" w:hAnsi="Arial"/>
+                <w:b w:val="0"/>
+                <w:sz w:val="14"/>
+              </w:rPr>
+            </w:r>
+            <w:r>
+              <w:rPr>
+                <w:rFonts w:ascii="Arial" w:hAnsi="Arial"/>
+                <w:b w:val="0"/>
+                <w:sz w:val="14"/>
+              </w:rPr>
+              <w:t>30</w:t>
+            </w:r>
+          </w:p>
+        </w:tc>
+        <w:tc>
+          <w:tcPr>
+            <w:tcW w:type="dxa" w:w="2057"/>
+          </w:tcPr>
+          <w:p>
+            <w:r>
+              <w:rPr>
+                <w:rFonts w:ascii="Arial" w:hAnsi="Arial"/>
+                <w:b w:val="0"/>
+                <w:sz w:val="14"/>
+              </w:rPr>
+            </w:r>
+            <w:r>
+              <w:rPr>
+                <w:rFonts w:ascii="Arial" w:hAnsi="Arial"/>
+                <w:b w:val="0"/>
+                <w:sz w:val="14"/>
+              </w:rPr>
+              <w:t>7.297</w:t>
+            </w:r>
+          </w:p>
+        </w:tc>
+        <w:tc>
+          <w:tcPr>
+            <w:tcW w:type="dxa" w:w="2057"/>
+          </w:tcPr>
+          <w:p>
+            <w:r>
+              <w:rPr>
+                <w:rFonts w:ascii="Arial" w:hAnsi="Arial"/>
+                <w:b w:val="0"/>
+                <w:sz w:val="14"/>
+              </w:rPr>
+            </w:r>
+            <w:r>
+              <w:rPr>
+                <w:rFonts w:ascii="Arial" w:hAnsi="Arial"/>
+                <w:b w:val="0"/>
+                <w:sz w:val="14"/>
+              </w:rPr>
+              <w:t>2.283</w:t>
+            </w:r>
+          </w:p>
+        </w:tc>
+        <w:tc>
+          <w:tcPr>
+            <w:tcW w:type="dxa" w:w="2057"/>
+          </w:tcPr>
+          <w:p>
+            <w:r>
+              <w:rPr>
+                <w:rFonts w:ascii="Arial" w:hAnsi="Arial"/>
+                <w:b w:val="0"/>
+                <w:sz w:val="14"/>
+              </w:rPr>
+            </w:r>
+            <w:r>
+              <w:rPr>
+                <w:rFonts w:ascii="Arial" w:hAnsi="Arial"/>
+                <w:b w:val="0"/>
+                <w:sz w:val="14"/>
+              </w:rPr>
+              <w:t>4.399</w:t>
+            </w:r>
+          </w:p>
+        </w:tc>
+        <w:tc>
+          <w:tcPr>
+            <w:tcW w:type="dxa" w:w="2057"/>
+          </w:tcPr>
+          <w:p>
+            <w:r>
+              <w:rPr>
+                <w:rFonts w:ascii="Arial" w:hAnsi="Arial"/>
+                <w:b w:val="0"/>
+                <w:sz w:val="14"/>
+              </w:rPr>
+            </w:r>
+            <w:r>
+              <w:rPr>
+                <w:rFonts w:ascii="Arial" w:hAnsi="Arial"/>
+                <w:b w:val="0"/>
+                <w:sz w:val="14"/>
+              </w:rPr>
+              <w:t>3.20x</w:t>
+            </w:r>
+          </w:p>
+        </w:tc>
+        <w:tc>
+          <w:tcPr>
+            <w:tcW w:type="dxa" w:w="2057"/>
+          </w:tcPr>
+          <w:p>
+            <w:r>
+              <w:rPr>
+                <w:rFonts w:ascii="Arial" w:hAnsi="Arial"/>
+                <w:b w:val="0"/>
+                <w:sz w:val="14"/>
+              </w:rPr>
+            </w:r>
+            <w:r>
+              <w:rPr>
+                <w:rFonts w:ascii="Arial" w:hAnsi="Arial"/>
+                <w:b w:val="0"/>
+                <w:sz w:val="14"/>
+              </w:rPr>
+            </w:r>
+            <w:r>
+              <w:rPr>
+                <w:rFonts w:ascii="Arial" w:hAnsi="Arial"/>
+                <w:b/>
+                <w:i w:val="0"/>
+                <w:sz w:val="14"/>
+              </w:rPr>
+              <w:t>1.66x</w:t>
+            </w:r>
+            <w:r>
+              <w:rPr>
+                <w:rFonts w:ascii="Arial" w:hAnsi="Arial"/>
+                <w:b w:val="0"/>
+                <w:sz w:val="14"/>
+              </w:rPr>
+            </w:r>
+          </w:p>
+        </w:tc>
+      </w:tr>
+      <w:tr>
+        <w:tc>
+          <w:tcPr>
+            <w:tcW w:type="dxa" w:w="2057"/>
+          </w:tcPr>
+          <w:p>
+            <w:r>
+              <w:rPr>
+                <w:rFonts w:ascii="Arial" w:hAnsi="Arial"/>
+                <w:b w:val="0"/>
+                <w:sz w:val="14"/>
+              </w:rPr>
+            </w:r>
+            <w:r>
+              <w:rPr>
+                <w:rFonts w:ascii="Arial" w:hAnsi="Arial"/>
+                <w:b w:val="0"/>
+                <w:sz w:val="14"/>
+              </w:rPr>
+              <w:t>INT64</w:t>
+            </w:r>
+          </w:p>
+        </w:tc>
+        <w:tc>
+          <w:tcPr>
+            <w:tcW w:type="dxa" w:w="2057"/>
+          </w:tcPr>
+          <w:p>
+            <w:r>
+              <w:rPr>
+                <w:rFonts w:ascii="Arial" w:hAnsi="Arial"/>
+                <w:b w:val="0"/>
+                <w:sz w:val="14"/>
+              </w:rPr>
+            </w:r>
+            <w:r>
+              <w:rPr>
+                <w:rFonts w:ascii="Arial" w:hAnsi="Arial"/>
+                <w:b w:val="0"/>
+                <w:sz w:val="14"/>
+              </w:rPr>
+              <w:t>6</w:t>
+            </w:r>
+          </w:p>
+        </w:tc>
+        <w:tc>
+          <w:tcPr>
+            <w:tcW w:type="dxa" w:w="2057"/>
+          </w:tcPr>
+          <w:p>
+            <w:r>
+              <w:rPr>
+                <w:rFonts w:ascii="Arial" w:hAnsi="Arial"/>
+                <w:b w:val="0"/>
+                <w:sz w:val="14"/>
+              </w:rPr>
+            </w:r>
+            <w:r>
+              <w:rPr>
+                <w:rFonts w:ascii="Arial" w:hAnsi="Arial"/>
+                <w:b w:val="0"/>
+                <w:sz w:val="14"/>
+              </w:rPr>
+              <w:t>11.280</w:t>
+            </w:r>
+          </w:p>
+        </w:tc>
+        <w:tc>
+          <w:tcPr>
+            <w:tcW w:type="dxa" w:w="2057"/>
+          </w:tcPr>
+          <w:p>
+            <w:r>
+              <w:rPr>
+                <w:rFonts w:ascii="Arial" w:hAnsi="Arial"/>
+                <w:b w:val="0"/>
+                <w:sz w:val="14"/>
+              </w:rPr>
+            </w:r>
+            <w:r>
+              <w:rPr>
+                <w:rFonts w:ascii="Arial" w:hAnsi="Arial"/>
+                <w:b w:val="0"/>
+                <w:sz w:val="14"/>
+              </w:rPr>
+              <w:t>5.668</w:t>
+            </w:r>
+          </w:p>
+        </w:tc>
+        <w:tc>
+          <w:tcPr>
+            <w:tcW w:type="dxa" w:w="2057"/>
+          </w:tcPr>
+          <w:p>
+            <w:r>
+              <w:rPr>
+                <w:rFonts w:ascii="Arial" w:hAnsi="Arial"/>
+                <w:b w:val="0"/>
+                <w:sz w:val="14"/>
+              </w:rPr>
+            </w:r>
+            <w:r>
+              <w:rPr>
+                <w:rFonts w:ascii="Arial" w:hAnsi="Arial"/>
+                <w:b w:val="0"/>
+                <w:sz w:val="14"/>
+              </w:rPr>
+              <w:t>8.009</w:t>
+            </w:r>
+          </w:p>
+        </w:tc>
+        <w:tc>
+          <w:tcPr>
+            <w:tcW w:type="dxa" w:w="2057"/>
+          </w:tcPr>
+          <w:p>
+            <w:r>
+              <w:rPr>
+                <w:rFonts w:ascii="Arial" w:hAnsi="Arial"/>
+                <w:b w:val="0"/>
+                <w:sz w:val="14"/>
+              </w:rPr>
+            </w:r>
+            <w:r>
+              <w:rPr>
+                <w:rFonts w:ascii="Arial" w:hAnsi="Arial"/>
+                <w:b w:val="0"/>
+                <w:sz w:val="14"/>
+              </w:rPr>
+              <w:t>1.99x</w:t>
+            </w:r>
+          </w:p>
+        </w:tc>
+        <w:tc>
+          <w:tcPr>
+            <w:tcW w:type="dxa" w:w="2057"/>
+          </w:tcPr>
+          <w:p>
+            <w:r>
+              <w:rPr>
+                <w:rFonts w:ascii="Arial" w:hAnsi="Arial"/>
+                <w:b w:val="0"/>
+                <w:sz w:val="14"/>
+              </w:rPr>
+            </w:r>
+            <w:r>
+              <w:rPr>
+                <w:rFonts w:ascii="Arial" w:hAnsi="Arial"/>
+                <w:b w:val="0"/>
+                <w:sz w:val="14"/>
+              </w:rPr>
+            </w:r>
+            <w:r>
+              <w:rPr>
+                <w:rFonts w:ascii="Arial" w:hAnsi="Arial"/>
+                <w:b/>
+                <w:i w:val="0"/>
+                <w:sz w:val="14"/>
+              </w:rPr>
+              <w:t>1.41x</w:t>
+            </w:r>
+            <w:r>
+              <w:rPr>
+                <w:rFonts w:ascii="Arial" w:hAnsi="Arial"/>
+                <w:b w:val="0"/>
+                <w:sz w:val="14"/>
+              </w:rPr>
+            </w:r>
+          </w:p>
+        </w:tc>
+      </w:tr>
+      <w:tr>
+        <w:tc>
+          <w:tcPr>
+            <w:tcW w:type="dxa" w:w="2057"/>
+          </w:tcPr>
+          <w:p>
+            <w:r>
+              <w:rPr>
+                <w:rFonts w:ascii="Arial" w:hAnsi="Arial"/>
+                <w:b w:val="0"/>
+                <w:sz w:val="14"/>
+              </w:rPr>
+            </w:r>
+            <w:r>
+              <w:rPr>
+                <w:rFonts w:ascii="Arial" w:hAnsi="Arial"/>
+                <w:b w:val="0"/>
+                <w:sz w:val="14"/>
+              </w:rPr>
+              <w:t>Combined</w:t>
+            </w:r>
+          </w:p>
+        </w:tc>
+        <w:tc>
+          <w:tcPr>
+            <w:tcW w:type="dxa" w:w="2057"/>
+          </w:tcPr>
+          <w:p>
+            <w:r>
+              <w:rPr>
+                <w:rFonts w:ascii="Arial" w:hAnsi="Arial"/>
+                <w:b w:val="0"/>
+                <w:sz w:val="14"/>
+              </w:rPr>
+            </w:r>
+            <w:r>
+              <w:rPr>
+                <w:rFonts w:ascii="Arial" w:hAnsi="Arial"/>
+                <w:b w:val="0"/>
+                <w:sz w:val="14"/>
+              </w:rPr>
+              <w:t>36</w:t>
+            </w:r>
+          </w:p>
+        </w:tc>
+        <w:tc>
+          <w:tcPr>
+            <w:tcW w:type="dxa" w:w="2057"/>
+          </w:tcPr>
+          <w:p>
+            <w:r>
+              <w:rPr>
+                <w:rFonts w:ascii="Arial" w:hAnsi="Arial"/>
+                <w:b w:val="0"/>
+                <w:sz w:val="14"/>
+              </w:rPr>
+            </w:r>
+            <w:r>
+              <w:rPr>
+                <w:rFonts w:ascii="Arial" w:hAnsi="Arial"/>
+                <w:b w:val="0"/>
+                <w:sz w:val="14"/>
+              </w:rPr>
+              <w:t>7.847</w:t>
+            </w:r>
+          </w:p>
+        </w:tc>
+        <w:tc>
+          <w:tcPr>
+            <w:tcW w:type="dxa" w:w="2057"/>
+          </w:tcPr>
+          <w:p>
+            <w:r>
+              <w:rPr>
+                <w:rFonts w:ascii="Arial" w:hAnsi="Arial"/>
+                <w:b w:val="0"/>
+                <w:sz w:val="14"/>
+              </w:rPr>
+            </w:r>
+            <w:r>
+              <w:rPr>
+                <w:rFonts w:ascii="Arial" w:hAnsi="Arial"/>
+                <w:b w:val="0"/>
+                <w:sz w:val="14"/>
+              </w:rPr>
+              <w:t>2.657</w:t>
+            </w:r>
+          </w:p>
+        </w:tc>
+        <w:tc>
+          <w:tcPr>
+            <w:tcW w:type="dxa" w:w="2057"/>
+          </w:tcPr>
+          <w:p>
+            <w:r>
+              <w:rPr>
+                <w:rFonts w:ascii="Arial" w:hAnsi="Arial"/>
+                <w:b w:val="0"/>
+                <w:sz w:val="14"/>
+              </w:rPr>
+            </w:r>
+            <w:r>
+              <w:rPr>
+                <w:rFonts w:ascii="Arial" w:hAnsi="Arial"/>
+                <w:b w:val="0"/>
+                <w:sz w:val="14"/>
+              </w:rPr>
+              <w:t>4.861</w:t>
+            </w:r>
+          </w:p>
+        </w:tc>
+        <w:tc>
+          <w:tcPr>
+            <w:tcW w:type="dxa" w:w="2057"/>
+          </w:tcPr>
+          <w:p>
+            <w:r>
+              <w:rPr>
+                <w:rFonts w:ascii="Arial" w:hAnsi="Arial"/>
+                <w:b w:val="0"/>
+                <w:sz w:val="14"/>
+              </w:rPr>
+            </w:r>
+            <w:r>
+              <w:rPr>
+                <w:rFonts w:ascii="Arial" w:hAnsi="Arial"/>
+                <w:b w:val="0"/>
+                <w:sz w:val="14"/>
+              </w:rPr>
+              <w:t>2.95x</w:t>
+            </w:r>
+          </w:p>
+        </w:tc>
+        <w:tc>
+          <w:tcPr>
+            <w:tcW w:type="dxa" w:w="2057"/>
+          </w:tcPr>
+          <w:p>
+            <w:r>
+              <w:rPr>
+                <w:rFonts w:ascii="Arial" w:hAnsi="Arial"/>
+                <w:b w:val="0"/>
+                <w:sz w:val="14"/>
+              </w:rPr>
+            </w:r>
+            <w:r>
+              <w:rPr>
+                <w:rFonts w:ascii="Arial" w:hAnsi="Arial"/>
+                <w:b w:val="0"/>
+                <w:sz w:val="14"/>
+              </w:rPr>
+            </w:r>
+            <w:r>
+              <w:rPr>
+                <w:rFonts w:ascii="Arial" w:hAnsi="Arial"/>
+                <w:b/>
+                <w:i w:val="0"/>
+                <w:sz w:val="14"/>
+              </w:rPr>
+              <w:t>1.61x</w:t>
+            </w:r>
+            <w:r>
+              <w:rPr>
+                <w:rFonts w:ascii="Arial" w:hAnsi="Arial"/>
+                <w:b w:val="0"/>
+                <w:sz w:val="14"/>
+              </w:rPr>
             </w:r>
           </w:p>
         </w:tc>
@@ -1007,315 +2677,106 @@
     </w:tbl>
     <w:p>
       <w:pPr>
-        <w:spacing w:after="0"/>
+        <w:pStyle w:val="Heading1"/>
       </w:pPr>
+      <w:r>
+        <w:t>Layout: where the remaining work comes from</w:t>
+      </w:r>
     </w:p>
-    <w:tbl>
-      <w:tblPr>
-        <w:tblStyle w:val="LightShading-Accent1"/>
-        <w:tblW w:type="auto" w:w="0"/>
-        <w:tblLook w:firstColumn="1" w:firstRow="1" w:lastColumn="0" w:lastRow="0" w:noHBand="0" w:noVBand="1" w:val="04A0"/>
-      </w:tblPr>
-      <w:tblGrid>
-        <w:gridCol w:w="2074"/>
-        <w:gridCol w:w="2074"/>
-        <w:gridCol w:w="2074"/>
-        <w:gridCol w:w="2074"/>
-        <w:gridCol w:w="2074"/>
-      </w:tblGrid>
-      <w:tr>
-        <w:tc>
-          <w:tcPr>
-            <w:tcW w:type="dxa" w:w="2074"/>
-          </w:tcPr>
-          <w:p>
-            <w:r>
-              <w:t>Decompression</w:t>
-            </w:r>
-          </w:p>
-        </w:tc>
-        <w:tc>
-          <w:tcPr>
-            <w:tcW w:type="dxa" w:w="2074"/>
-          </w:tcPr>
-          <w:p>
-            <w:r>
-              <w:t>Cases</w:t>
-            </w:r>
-          </w:p>
-        </w:tc>
-        <w:tc>
-          <w:tcPr>
-            <w:tcW w:type="dxa" w:w="2074"/>
-          </w:tcPr>
-          <w:p>
-            <w:r>
-              <w:t>PatchedDelta GB/s</w:t>
-            </w:r>
-          </w:p>
-        </w:tc>
-        <w:tc>
-          <w:tcPr>
-            <w:tcW w:type="dxa" w:w="2074"/>
-          </w:tcPr>
-          <w:p>
-            <w:r>
-              <w:t>DBPDelta GB/s</w:t>
-            </w:r>
-          </w:p>
-        </w:tc>
-        <w:tc>
-          <w:tcPr>
-            <w:tcW w:type="dxa" w:w="2074"/>
-          </w:tcPr>
-          <w:p>
-            <w:r>
-              <w:t>PatchedDelta speedup</w:t>
-            </w:r>
-          </w:p>
-        </w:tc>
-      </w:tr>
-      <w:tr>
-        <w:tc>
-          <w:tcPr>
-            <w:tcW w:type="dxa" w:w="2074"/>
-          </w:tcPr>
-          <w:p>
-            <w:r>
-              <w:t>INT32</w:t>
-            </w:r>
-          </w:p>
-        </w:tc>
-        <w:tc>
-          <w:tcPr>
-            <w:tcW w:type="dxa" w:w="2074"/>
-          </w:tcPr>
-          <w:p>
-            <w:pPr>
-              <w:jc w:val="right"/>
-            </w:pPr>
-            <w:r>
-              <w:t>30</w:t>
-            </w:r>
-          </w:p>
-        </w:tc>
-        <w:tc>
-          <w:tcPr>
-            <w:tcW w:type="dxa" w:w="2074"/>
-          </w:tcPr>
-          <w:p>
-            <w:pPr>
-              <w:jc w:val="right"/>
-            </w:pPr>
-            <w:r>
-              <w:t>7.256</w:t>
-            </w:r>
-          </w:p>
-        </w:tc>
-        <w:tc>
-          <w:tcPr>
-            <w:tcW w:type="dxa" w:w="2074"/>
-          </w:tcPr>
-          <w:p>
-            <w:pPr>
-              <w:jc w:val="right"/>
-            </w:pPr>
-            <w:r>
-              <w:t>2.283</w:t>
-            </w:r>
-          </w:p>
-        </w:tc>
-        <w:tc>
-          <w:tcPr>
-            <w:tcW w:type="dxa" w:w="2074"/>
-          </w:tcPr>
-          <w:p>
-            <w:pPr>
-              <w:jc w:val="right"/>
-            </w:pPr>
-            <w:r>
-              <w:rPr>
-                <w:b/>
-              </w:rPr>
-              <w:t>3.18x</w:t>
-            </w:r>
-          </w:p>
-        </w:tc>
-      </w:tr>
-      <w:tr>
-        <w:tc>
-          <w:tcPr>
-            <w:tcW w:type="dxa" w:w="2074"/>
-          </w:tcPr>
-          <w:p>
-            <w:r>
-              <w:t>INT64</w:t>
-            </w:r>
-          </w:p>
-        </w:tc>
-        <w:tc>
-          <w:tcPr>
-            <w:tcW w:type="dxa" w:w="2074"/>
-          </w:tcPr>
-          <w:p>
-            <w:pPr>
-              <w:jc w:val="right"/>
-            </w:pPr>
-            <w:r>
-              <w:t>6</w:t>
-            </w:r>
-          </w:p>
-        </w:tc>
-        <w:tc>
-          <w:tcPr>
-            <w:tcW w:type="dxa" w:w="2074"/>
-          </w:tcPr>
-          <w:p>
-            <w:pPr>
-              <w:jc w:val="right"/>
-            </w:pPr>
-            <w:r>
-              <w:t>11.314</w:t>
-            </w:r>
-          </w:p>
-        </w:tc>
-        <w:tc>
-          <w:tcPr>
-            <w:tcW w:type="dxa" w:w="2074"/>
-          </w:tcPr>
-          <w:p>
-            <w:pPr>
-              <w:jc w:val="right"/>
-            </w:pPr>
-            <w:r>
-              <w:t>5.668</w:t>
-            </w:r>
-          </w:p>
-        </w:tc>
-        <w:tc>
-          <w:tcPr>
-            <w:tcW w:type="dxa" w:w="2074"/>
-          </w:tcPr>
-          <w:p>
-            <w:pPr>
-              <w:jc w:val="right"/>
-            </w:pPr>
-            <w:r>
-              <w:rPr>
-                <w:b/>
-              </w:rPr>
-              <w:t>2.00x</w:t>
-            </w:r>
-          </w:p>
-        </w:tc>
-      </w:tr>
-      <w:tr>
-        <w:tc>
-          <w:tcPr>
-            <w:tcW w:type="dxa" w:w="2074"/>
-          </w:tcPr>
-          <w:p>
-            <w:r>
-              <w:t>Combined</w:t>
-            </w:r>
-          </w:p>
-        </w:tc>
-        <w:tc>
-          <w:tcPr>
-            <w:tcW w:type="dxa" w:w="2074"/>
-          </w:tcPr>
-          <w:p>
-            <w:pPr>
-              <w:jc w:val="right"/>
-            </w:pPr>
-            <w:r>
-              <w:t>36</w:t>
-            </w:r>
-          </w:p>
-        </w:tc>
-        <w:tc>
-          <w:tcPr>
-            <w:tcW w:type="dxa" w:w="2074"/>
-          </w:tcPr>
-          <w:p>
-            <w:pPr>
-              <w:jc w:val="right"/>
-            </w:pPr>
-            <w:r>
-              <w:t>7.814</w:t>
-            </w:r>
-          </w:p>
-        </w:tc>
-        <w:tc>
-          <w:tcPr>
-            <w:tcW w:type="dxa" w:w="2074"/>
-          </w:tcPr>
-          <w:p>
-            <w:pPr>
-              <w:jc w:val="right"/>
-            </w:pPr>
-            <w:r>
-              <w:t>2.657</w:t>
-            </w:r>
-          </w:p>
-        </w:tc>
-        <w:tc>
-          <w:tcPr>
-            <w:tcW w:type="dxa" w:w="2074"/>
-          </w:tcPr>
-          <w:p>
-            <w:pPr>
-              <w:jc w:val="right"/>
-            </w:pPr>
-            <w:r>
-              <w:rPr>
-                <w:b/>
-              </w:rPr>
-              <w:t>2.94x</w:t>
-            </w:r>
-          </w:p>
-        </w:tc>
-      </w:tr>
-    </w:tbl>
     <w:p>
-      <w:pPr>
-        <w:spacing w:after="0"/>
-      </w:pPr>
+      <w:r>
+        <w:t>Every bracket below is inside one independently decodable 1,024-value PFOR vector.</w:t>
+      </w:r>
+    </w:p>
+    <w:p>
+      <w:r>
+        <w:rPr>
+          <w:rFonts w:ascii="Courier New" w:hAnsi="Courier New"/>
+          <w:sz w:val="14"/>
+        </w:rPr>
+        <w:t>PFOR-PatchedDelta</w:t>
+        <w:br/>
+        <w:t>+----------------+-------+----------------------+---------------------------+</w:t>
+        <w:br/>
+        <w:t>| frame,width,   | first | 1,024 packed offsets | sparse exception positions|</w:t>
+        <w:br/>
+        <w:t>| delta flag,... | value | at ONE bit width     | and exception differences |</w:t>
+        <w:br/>
+        <w:t>+----------------+-------+----------------------+---------------------------+</w:t>
+        <w:br/>
+        <w:t xml:space="preserve">                    one unpack call                 patch before prefix sum</w:t>
+        <w:br/>
+        <w:br/>
+        <w:t>PFOR-DBPDelta (INT32; INT64 has 4 blocks and 16 miniblocks)</w:t>
+        <w:br/>
+        <w:t>+------------+-------+----------------------------------------------------+</w:t>
+        <w:br/>
+        <w:t>| DBP header | first | 8 blocks x [min_delta | 4 widths | 4 miniblocks]   |</w:t>
+        <w:br/>
+        <w:t>+------------+-------+----------------------------------------------------+</w:t>
+        <w:br/>
+        <w:t xml:space="preserve">                        32 miniblocks; widths may change at each boundary</w:t>
+      </w:r>
+    </w:p>
+    <w:p>
+      <w:r>
+        <w:t>DBP's block metadata can represent four local widths without exceptions, but decoding must observe those boundaries. Optimized DBP removes avoidable overhead within that layout; it cannot turn unequal-width miniblocks, or miniblocks in different blocks, into PatchedDelta's single-width run.</w:t>
+      </w:r>
     </w:p>
     <w:p>
       <w:pPr>
         <w:pStyle w:val="Heading1"/>
       </w:pPr>
       <w:r>
-        <w:t>Why PatchedDelta decompresses faster</w:t>
+        <w:t>Decode pseudocode</w:t>
       </w:r>
     </w:p>
     <w:p>
-      <w:pPr>
-        <w:spacing w:after="100"/>
-      </w:pPr>
-      <w:r>
-        <w:t xml:space="preserve">Both implementations call Arrow's same SIMD </w:t>
-      </w:r>
       <w:r>
         <w:rPr>
-          <w:rFonts w:ascii="Consolas" w:hAnsi="Consolas"/>
-          <w:sz w:val="16"/>
+          <w:rFonts w:ascii="Courier New" w:hAnsi="Courier New"/>
+          <w:sz w:val="14"/>
         </w:rPr>
-        <w:t>internal::unpack</w:t>
+        <w:t>PatchedDelta(vector):</w:t>
+        <w:br/>
+        <w:t xml:space="preserve">  read one frame, width, start value, and exception list</w:t>
+        <w:br/>
+        <w:t xml:space="preserve">  unpack_bias(all 1,024 offsets, width, frame)       // one unpack invocation</w:t>
+        <w:br/>
+        <w:t xml:space="preserve">  patch sparse exception differences</w:t>
+        <w:br/>
+        <w:t xml:space="preserve">  values = prefix_sum(differences, start)            // one scalar pass today</w:t>
+        <w:br/>
+        <w:br/>
+        <w:t>BaselineDBP(vector):</w:t>
+        <w:br/>
+        <w:t xml:space="preserve">  for each block:</w:t>
+        <w:br/>
+        <w:t xml:space="preserve">    read min_delta and four widths</w:t>
+        <w:br/>
+        <w:t xml:space="preserve">    for each miniblock:</w:t>
+        <w:br/>
+        <w:t xml:space="preserve">      GetBatch(one miniblock, its width)              // 32/16 invocations total</w:t>
+        <w:br/>
+        <w:t xml:space="preserve">      for each delta: value = previous + min_delta + offset</w:t>
+        <w:br/>
+        <w:br/>
+        <w:t>OptimizedDBP(vector):</w:t>
+        <w:br/>
+        <w:t xml:space="preserve">  for each block:</w:t>
+        <w:br/>
+        <w:t xml:space="preserve">    read min_delta and four widths</w:t>
+        <w:br/>
+        <w:t xml:space="preserve">    coalesce adjacent miniblocks having the same width</w:t>
+        <w:br/>
+        <w:t xml:space="preserve">    for each equal-width run: GetBatch(run, width)    // fewer, data-dependent calls</w:t>
+        <w:br/>
+        <w:t xml:space="preserve">    SIMD inclusive_scan(offsets + min_delta, carry)  // register prefix scan</w:t>
       </w:r>
+    </w:p>
+    <w:p>
       <w:r>
-        <w:t xml:space="preserve">; the difference is the work around it. PatchedDelta has one bit width for a 1,024-value vector, invokes the unpacker once, folds its frame bias into that unpack, patches sparse exceptions, and makes one prefix-sum pass. DBPDelta divides the same vector into 32 INT32 or 16 INT64 miniblocks. For each block/miniblock the decoder parses a min delta and width, re-enters </w:t>
-      </w:r>
-      <w:r>
-        <w:rPr>
-          <w:rFonts w:ascii="Consolas" w:hAnsi="Consolas"/>
-          <w:sz w:val="16"/>
-        </w:rPr>
-        <w:t>BitReader::GetBatch</w:t>
-      </w:r>
-      <w:r>
-        <w:t>, and reconstructs each value from the unpacked offset, min delta, and previous value. Thus it pays more dispatch/state transitions and more reconstruction work while using the same underlying unpack kernel. A control run of whole-page DBP versus DBP restarted every 1,024 values retained 95.6% of decode throughput, so per-vector header parsing explains only about 4.4%; the miniblock and reconstruction path explains the bulk of the measured gap.</w:t>
+        <w:t>Both layouts ultimately use Arrow's SIMD unpack kernels. The two DBP commits prove that implementation mattered: optimized DBP is 1.59x faster than baseline on the beneficial class and 1.83x faster on the non-beneficial class. PatchedDelta still wins because its metadata selects one width for the whole vector, its frame bias is fused into one unpack, and only sparse exceptions intervene before one prefix sum. DBP still parses per-block minima and widths and executes a data-dependent number of unpack runs. A separate control found that restarting DBP every 1,024 values retains 95.6% of whole-page DBP throughput, so repeated vector headers account for only about 4.4%.</w:t>
       </w:r>
     </w:p>
     <w:p>
@@ -1327,26 +2788,25 @@
       </w:r>
     </w:p>
     <w:p>
-      <w:pPr>
-        <w:spacing w:after="100"/>
-      </w:pPr>
       <w:r>
-        <w:t xml:space="preserve">Keep the current per-vector planner and </w:t>
+        <w:t xml:space="preserve">Keep </w:t>
       </w:r>
       <w:r>
         <w:rPr>
-          <w:rFonts w:ascii="Consolas" w:hAnsi="Consolas"/>
+          <w:rFonts w:ascii="Courier New" w:hAnsi="Courier New"/>
+          <w:b w:val="0"/>
+          <w:i w:val="0"/>
           <w:sz w:val="16"/>
         </w:rPr>
         <w:t>PFOR-PatchedDelta</w:t>
       </w:r>
       <w:r>
-        <w:t xml:space="preserve"> payload. On columns where delta mode helps, PatchedDelta is 35.1% smaller and 2.61x faster to decompress than DBPDelta. Even when delta mode should not be selected, PatchedDelta remains 2.1% smaller and 2.94x faster. DBPDelta's advantage is encode throughput: 1.87x faster on the beneficial class and 1.60x faster on the non-beneficial class. That trade is not enough to replace the current layout for a storage encoding optimized for compression and repeated reads.</w:t>
+        <w:t>. On delta-beneficial data it is 35.1% smaller and 1.65x faster to decompress than optimized DBPDelta; on non-beneficial data it is 2.1% smaller and 1.61x faster. DBPDelta encodes 1.87x and 1.59x faster respectively, but the optimized decode results show that neither the baseline 2.6-3.0x result nor a claim that both delta layouts should perform alike is accurate.</w:t>
       </w:r>
     </w:p>
     <w:sectPr>
-      <w:pgSz w:w="12240" w:h="15840"/>
-      <w:pgMar w:top="792" w:right="936" w:bottom="792" w:left="936" w:header="720" w:footer="720" w:gutter="0"/>
+      <w:pgSz w:w="15840" w:h="12240" w:orient="landscape"/>
+      <w:pgMar w:top="648" w:right="720" w:bottom="648" w:left="720" w:header="720" w:footer="720" w:gutter="0"/>
       <w:cols w:space="720"/>
       <w:docGrid w:linePitch="360"/>
     </w:sectPr>
@@ -1717,9 +3177,12 @@
     <w:name w:val="Normal"/>
     <w:qFormat/>
     <w:rsid w:val="00FC693F"/>
+    <w:pPr>
+      <w:spacing w:after="60"/>
+    </w:pPr>
     <w:rPr>
-      <w:rFonts w:ascii="Aptos" w:hAnsi="Aptos"/>
-      <w:sz w:val="18"/>
+      <w:rFonts w:ascii="Arial" w:hAnsi="Arial"/>
+      <w:sz w:val="17"/>
     </w:rPr>
   </w:style>
   <w:style w:type="paragraph" w:styleId="Header">
@@ -1777,11 +3240,11 @@
     <w:pPr>
       <w:keepNext/>
       <w:keepLines/>
-      <w:spacing w:before="480" w:after="0"/>
+      <w:spacing w:before="160" w:after="80"/>
       <w:outlineLvl w:val="0"/>
     </w:pPr>
     <w:rPr>
-      <w:rFonts w:asciiTheme="majorHAnsi" w:eastAsiaTheme="majorEastAsia" w:hAnsiTheme="majorHAnsi" w:cstheme="majorBidi" w:ascii="Aptos Display" w:hAnsi="Aptos Display"/>
+      <w:rFonts w:asciiTheme="majorHAnsi" w:eastAsiaTheme="majorEastAsia" w:hAnsiTheme="majorHAnsi" w:cstheme="majorBidi" w:ascii="Arial" w:hAnsi="Arial"/>
       <w:b/>
       <w:bCs/>
       <w:color w:val="244A73"/>
@@ -2066,11 +3529,11 @@
       <w:pBdr>
         <w:bottom w:val="single" w:sz="8" w:space="4" w:color="4F81BD" w:themeColor="accent1"/>
       </w:pBdr>
-      <w:spacing w:after="300" w:line="240" w:lineRule="auto"/>
+      <w:spacing w:after="80" w:line="240" w:lineRule="auto" w:before="160"/>
       <w:contextualSpacing/>
     </w:pPr>
     <w:rPr>
-      <w:rFonts w:asciiTheme="majorHAnsi" w:eastAsiaTheme="majorEastAsia" w:hAnsiTheme="majorHAnsi" w:cstheme="majorBidi" w:ascii="Aptos Display" w:hAnsi="Aptos Display"/>
+      <w:rFonts w:asciiTheme="majorHAnsi" w:eastAsiaTheme="majorEastAsia" w:hAnsiTheme="majorHAnsi" w:cstheme="majorBidi" w:ascii="Arial" w:hAnsi="Arial"/>
       <w:color w:val="17365D"/>
       <w:spacing w:val="5"/>
       <w:kern w:val="28"/>

</xml_diff>

<commit_message>
Define the compared PFOR delta variants
</commit_message>
<xml_diff>
--- a/pfor_delta_layout_report.docx
+++ b/pfor_delta_layout_report.docx
@@ -8,6 +8,72 @@
       </w:pPr>
       <w:r>
         <w:t>PFOR delta payload layout: PatchedDelta or DBPDelta?</w:t>
+      </w:r>
+    </w:p>
+    <w:p>
+      <w:pPr>
+        <w:pStyle w:val="Heading1"/>
+      </w:pPr>
+      <w:r>
+        <w:t>What the three variants are</w:t>
+      </w:r>
+    </w:p>
+    <w:p>
+      <w:r>
+        <w:t>All three variants first turn the original values into differences between adjacent values. They differ in how those differences are stored and decoded:</w:t>
+      </w:r>
+    </w:p>
+    <w:p>
+      <w:pPr>
+        <w:pStyle w:val="ListBullet"/>
+      </w:pPr>
+      <w:r/>
+      <w:r>
+        <w:rPr>
+          <w:b/>
+          <w:i w:val="0"/>
+        </w:rPr>
+        <w:t>PFOR-PatchedDelta</w:t>
+      </w:r>
+      <w:r>
+        <w:t xml:space="preserve"> is the current PFOR delta layout. Each independently decodable 1,024-value vector selects one frame and one bit width. Most differences are stored as fixed-width offsets from that frame; differences that do not fit are stored as exceptions and patched before the prefix sum reconstructs the original values.</w:t>
+      </w:r>
+    </w:p>
+    <w:p>
+      <w:pPr>
+        <w:pStyle w:val="ListBullet"/>
+      </w:pPr>
+      <w:r/>
+      <w:r>
+        <w:rPr>
+          <w:b/>
+          <w:i w:val="0"/>
+        </w:rPr>
+        <w:t>PFOR-DBPDelta (baseline DBP)</w:t>
+      </w:r>
+      <w:r>
+        <w:t xml:space="preserve"> replaces that per-vector PFOR payload with a canonical Parquet DELTA_BINARY_PACKED stream. For INT32 it divides the vector into eight 128-value blocks and 32 miniblocks; for INT64 it uses four 256-value blocks and 16 miniblocks. Every block stores a minimum difference and every miniblock can use a different bit width. The baseline Arrow decoder unpacks and reconstructs one miniblock at a time.</w:t>
+      </w:r>
+    </w:p>
+    <w:p>
+      <w:pPr>
+        <w:pStyle w:val="ListBullet"/>
+      </w:pPr>
+      <w:r/>
+      <w:r>
+        <w:rPr>
+          <w:b/>
+          <w:i w:val="0"/>
+        </w:rPr>
+        <w:t>PFOR-DBPDelta (optimized DBP)</w:t>
+      </w:r>
+      <w:r>
+        <w:t xml:space="preserve"> has exactly the same bytes and compression ratio as baseline DBP. Only its decoder changes: it combines adjacent equal-width miniblocks into larger unpack calls and uses an SIMD register prefix scan to reconstruct values.</w:t>
+      </w:r>
+    </w:p>
+    <w:p>
+      <w:r>
+        <w:t>Consequently, this comparison separates two questions: whether PFOR's patched, single-width layout is preferable to DBP's block/miniblock layout, and how much of the original speed difference came from DBP decoder implementation rather than the format.</w:t>
       </w:r>
     </w:p>
     <w:p>

</xml_diff>